<commit_message>
docs: Update Word report with high-res visual PNG diagram images
</commit_message>
<xml_diff>
--- a/Bao_Cao_Phan_Tich_He_Thong_Plant_Book_GIS_Tanbao_AgTech.docx
+++ b/Bao_Cao_Phan_Tich_He_Thong_Plant_Book_GIS_Tanbao_AgTech.docx
@@ -4,7 +4,7 @@
   <w:body>
     <w:p>
       <w:pPr>
-        <w:spacing w:before="300" w:after="80"/>
+        <w:spacing w:before="200" w:after="80"/>
         <w:jc w:val="center"/>
       </w:pPr>
       <w:r>
@@ -13,7 +13,7 @@
           <w:color w:val="065F46"/>
           <w:sz w:val="40"/>
         </w:rPr>
-        <w:t>BÁO CÁO PHÂN TÍCH CHUYÊN SÂU TOÀN BỘ HỆ THỐNG</w:t>
+        <w:t>BÁO CÁO TOÀN DIỆN HỆ THỐNG GIS &amp; ERP NÔNG NGHIỆP</w:t>
       </w:r>
     </w:p>
     <w:p>
@@ -25,11 +25,11 @@
         <w:rPr>
           <w:b/>
           <w:color w:val="0284C7"/>
-          <w:sz w:val="26"/>
+          <w:sz w:val="24"/>
         </w:rPr>
-        <w:t>ỨNG DỤNG BẢN ĐỒ GIS TRANG TRẠI, SỔ CÂY TRỒNG SỐ &amp; BẢN VẼ KỸ THUẬT CAD A4</w:t>
+        <w:t>PHÂN TÍCH TÍNH NĂNG, QUY TRÌNH VẬN HÀNH, SƠ ĐỒ LUỒNG LUẬN LÝ &amp; LỘ TRÌNH NÂNG CẤP ERP DOANH NGHIỆP</w:t>
         <w:br/>
-        <w:t>TÂN BẢO AGTECH</w:t>
+        <w:t>CÔNG TY TNHH CÔNG NGHỆ NÔNG NGHIỆP TÂN BẢO SÀI GÒN</w:t>
       </w:r>
     </w:p>
     <w:tbl>
@@ -59,10 +59,10 @@
               <w:rPr>
                 <w:b/>
               </w:rPr>
-              <w:t xml:space="preserve">🏢 Đơn vị phát triển: </w:t>
+              <w:t xml:space="preserve">🏢 Tên dự án: </w:t>
             </w:r>
             <w:r>
-              <w:t>Công ty TNHH Công Nghệ Nông Nghiệp Tân Bảo Sài Gòn (Tanbao AgTech)</w:t>
+              <w:t>Plant Book GIS &amp; Farm Management System (Tân Bảo AgTech)</w:t>
             </w:r>
           </w:p>
         </w:tc>
@@ -107,10 +107,10 @@
               <w:rPr>
                 <w:b/>
               </w:rPr>
-              <w:t xml:space="preserve">💻 Phạm vi khảo sát: </w:t>
+              <w:t xml:space="preserve">💻 Kiến trúc ứng dụng: </w:t>
             </w:r>
             <w:r>
-              <w:t>Toàn bộ Codebase (Backend Express JS, Frontend Admin &amp; User Portal)</w:t>
+              <w:t>Fullstack Node.js Express, Mapbox GIS v3, Turf.js, Web NFC, PWA</w:t>
             </w:r>
           </w:p>
         </w:tc>
@@ -130,10 +130,10 @@
               <w:rPr>
                 <w:b/>
               </w:rPr>
-              <w:t xml:space="preserve">📌 Trạng thái dự án: </w:t>
+              <w:t xml:space="preserve">🎯 Định hướng chiến lược: </w:t>
             </w:r>
             <w:r>
-              <w:t>Hoàn thiện 100% Các Mục tiêu &amp; Tính năng GIS/CAD/NFC</w:t>
+              <w:t>Nâng cấp lên Hệ sinh thái Agricultural ERP &amp; AI IoT Enterprise</w:t>
             </w:r>
           </w:p>
         </w:tc>
@@ -177,7 +177,7 @@
                 <w:color w:val="065F46"/>
                 <w:sz w:val="22"/>
               </w:rPr>
-              <w:t>💡 TỔNG QUAN TÀI LIỆU</w:t>
+              <w:t>💡 TỔNG QUAN BÁO CÁO</w:t>
               <w:br/>
             </w:r>
             <w:r>
@@ -185,7 +185,7 @@
                 <w:color w:val="0F172A"/>
                 <w:sz w:val="21"/>
               </w:rPr>
-              <w:t>Tài liệu này tổng hợp phân tích chuyên sâu về kiến trúc phần mềm, cấu trúc thư mục mã nguồn, các mục tiêu tính năng đã hoàn thành (Bản đồ GIS, Đường đồng mức DEM thực tế, Xuất Hồ sơ Bản vẽ CAD A4 chuẩn doanh nghiệp, Sổ Cây Trồng Số, Thẻ NFC Truy xuất Nguồn gốc) cùng quy trình vận hành hệ thống chi tiết.</w:t>
+              <w:t>Tài liệu này bao gồm phân tích chuyên sâu toàn bộ ứng dụng Plant Book GIS Tân Bảo AgTech: Khái niệm &amp; Mục đích sử dụng của 13 tính năng cốt lõi, Sơ đồ luồng &amp; Diagram Process, Quy trình vận hành &amp; Cách thức áp dụng thực tế tại trang trại, cùng Lộ trình nâng cấp toàn diện đưa phần mềm đạt tiêu chuẩn ERP Nông Nghiệp Chuyên Nghiệp (Enterprise Farm ERP).</w:t>
             </w:r>
           </w:p>
         </w:tc>
@@ -195,7 +195,7 @@
     <w:p>
       <w:pPr>
         <w:keepNext/>
-        <w:spacing w:before="320" w:after="120"/>
+        <w:spacing w:before="360" w:after="120"/>
       </w:pPr>
       <w:r>
         <w:rPr>
@@ -203,167 +203,12 @@
           <w:color w:val="065F46"/>
           <w:sz w:val="32"/>
         </w:rPr>
-        <w:t>1. TỔNG QUAN &amp; MỤC TIÊU DỰ ÁN</w:t>
+        <w:t>1. DANH MỤC TÍNH NĂNG, KHÁI NIỆM &amp; MỤC ĐÍCH SỬ DỤNG</w:t>
       </w:r>
     </w:p>
     <w:p>
       <w:r>
-        <w:rPr>
-          <w:color w:val="0F172A"/>
-        </w:rPr>
-        <w:t xml:space="preserve">Hệ thống </w:t>
-      </w:r>
-      <w:r>
-        <w:rPr>
-          <w:b/>
-        </w:rPr>
-        <w:t>Plant Book GIS &amp; Farm Management System</w:t>
-      </w:r>
-      <w:r>
-        <w:t xml:space="preserve"> là giải pháp chuyển đổi số nông nghiệp toàn diện do Công ty TNHH Công Nghệ Nông Nghiệp Tân Bảo Sài Gòn phát triển. Dự án được thiết kế nhằm số hóa quy trình quản lý trang trại từ cấp độ địa hình tổng thể đến từng mốc ranh giới, đường đồng mức cao độ địa hình, quản lý vị trí từng cây trồng bằng GPS, gắn thẻ NFC truy xuất nguồn gốc công khai và quản lý chi phí vật tư nông nghiệp.</w:t>
-      </w:r>
-    </w:p>
-    <w:p>
-      <w:pPr>
-        <w:keepNext/>
-        <w:spacing w:before="240" w:after="80"/>
-      </w:pPr>
-      <w:r>
-        <w:rPr>
-          <w:b/>
-          <w:color w:val="0284C7"/>
-          <w:sz w:val="26"/>
-        </w:rPr>
-        <w:t>1.1 Các Mục Tiêu Chiến Lược Đã Đạt Được</w:t>
-      </w:r>
-    </w:p>
-    <w:p>
-      <w:pPr>
-        <w:pStyle w:val="ListBullet"/>
-        <w:spacing w:after="60"/>
-      </w:pPr>
-      <w:r>
-        <w:rPr>
-          <w:b/>
-          <w:color w:val="065F46"/>
-        </w:rPr>
-        <w:t xml:space="preserve">Số hóa Bản đồ Kỹ thuật GIS Trang trại: </w:t>
-      </w:r>
-      <w:r>
-        <w:t>Quản lý đa giác ranh giới trang trại chuẩn không gian, đo đạc trắc địa chiều dài từng cạnh (AB, BC, CD...), tính chu vi và diện tích thực tế (m² &amp; ha).</w:t>
-      </w:r>
-    </w:p>
-    <w:p>
-      <w:pPr>
-        <w:pStyle w:val="ListBullet"/>
-        <w:spacing w:after="60"/>
-      </w:pPr>
-      <w:r>
-        <w:rPr>
-          <w:b/>
-          <w:color w:val="065F46"/>
-        </w:rPr>
-        <w:t xml:space="preserve">Trích xuất Địa hình Đường Đồng Mức THỰC TẾ (DEM): </w:t>
-      </w:r>
-      <w:r>
-        <w:t>Khôi phục 100% dữ liệu cao độ thực tế từ Mapbox Terrain-DEM, trích xuất đường bình độ đồng mức (interval 1m/5m) và gắn nhãn số cao độ nổi bật (Major Contour Labels).</w:t>
-      </w:r>
-    </w:p>
-    <w:p>
-      <w:pPr>
-        <w:pStyle w:val="ListBullet"/>
-        <w:spacing w:after="60"/>
-      </w:pPr>
-      <w:r>
-        <w:rPr>
-          <w:b/>
-          <w:color w:val="065F46"/>
-        </w:rPr>
-        <w:t xml:space="preserve">Xuất Hồ Sơ Bản Vẽ Kỹ Thuật CAD A4 Nằm Ngang Chuẩn Doanh Nghiệp: </w:t>
-      </w:r>
-      <w:r>
-        <w:t>Xuất bản vẽ chuẩn tỷ lệ 1:1, tích hợp kính lúp phóng đại mặt cắt hẹp A-A, chú giải ký hiệu CAD, bảng thống kê thông số, bảng chiều dài các cạnh ranh giới và Khung Tên Hồ Sơ (Title Block). Đặc biệt mở khóa tính năng cho phép tùy chỉnh linh hoạt 100% mọi ô chữ/số trước khi In/PDF.</w:t>
-      </w:r>
-    </w:p>
-    <w:p>
-      <w:pPr>
-        <w:pStyle w:val="ListBullet"/>
-        <w:spacing w:after="60"/>
-      </w:pPr>
-      <w:r>
-        <w:rPr>
-          <w:b/>
-          <w:color w:val="065F46"/>
-        </w:rPr>
-        <w:t xml:space="preserve">Sổ Cây Trồng Số &amp; Định Danh Cây Trồng: </w:t>
-      </w:r>
-      <w:r>
-        <w:t>Quản lý mã cây, tọa độ GPS, giống cây, tình trạng sức khỏe và nhật ký chăm sóc hình ảnh thực tế.</w:t>
-      </w:r>
-    </w:p>
-    <w:p>
-      <w:pPr>
-        <w:pStyle w:val="ListBullet"/>
-        <w:spacing w:after="60"/>
-      </w:pPr>
-      <w:r>
-        <w:rPr>
-          <w:b/>
-          <w:color w:val="065F46"/>
-        </w:rPr>
-        <w:t xml:space="preserve">Truy Xuất Nguồn Gốc NFC &amp; QR Code (Public Passport): </w:t>
-      </w:r>
-      <w:r>
-        <w:t>Tích hợp giao diện quét/ghi thẻ NFC vật lý, tạo trang Truy xuất nguồn gốc công khai cho người tiêu dùng và đối tác kiểm tra lịch sử canh tác minh bạch mà không cần đăng nhập.</w:t>
-      </w:r>
-    </w:p>
-    <w:p>
-      <w:pPr>
-        <w:pStyle w:val="ListBullet"/>
-        <w:spacing w:after="60"/>
-      </w:pPr>
-      <w:r>
-        <w:rPr>
-          <w:b/>
-          <w:color w:val="065F46"/>
-        </w:rPr>
-        <w:t xml:space="preserve">Quản Lý Kho &amp; Tiêu Hao Vật Tư Nông Nghiệp: </w:t>
-      </w:r>
-      <w:r>
-        <w:t>Theo dõi xuất/nhập kho phân bón, thuốc BVTV, nhiên liệu, nhân công, tự động tính tổng chi phí sản xuất theo ngày/tháng/quý/năm.</w:t>
-      </w:r>
-    </w:p>
-    <w:p>
-      <w:pPr>
-        <w:keepNext/>
-        <w:spacing w:before="320" w:after="120"/>
-      </w:pPr>
-      <w:r>
-        <w:rPr>
-          <w:b/>
-          <w:color w:val="065F46"/>
-          <w:sz w:val="32"/>
-        </w:rPr>
-        <w:t>2. KIẾN TRÚC CÔNG NGHỆ &amp; CẤU TRÚC MÃ NGUỒN</w:t>
-      </w:r>
-    </w:p>
-    <w:p>
-      <w:r>
-        <w:t>Ứng dụng được thiết kế theo kiến trúc Client-Server hiện đại, chia tách rõ ràng giữa Backend RESTful API / WebSocket với 2 phân hệ Frontend độc lập (Admin Portal và User/Nông hộ Portal).</w:t>
-      </w:r>
-    </w:p>
-    <w:p>
-      <w:pPr>
-        <w:keepNext/>
-        <w:spacing w:before="240" w:after="80"/>
-      </w:pPr>
-      <w:r>
-        <w:rPr>
-          <w:b/>
-          <w:color w:val="0284C7"/>
-          <w:sz w:val="26"/>
-        </w:rPr>
-        <w:t>2.1 Công Nghệ Sử Dụng (Tech Stack)</w:t>
+        <w:t>Bảng dưới đây hệ thống hóa toàn bộ 13 phân hệ &amp; tính năng hiện tại của ứng dụng, mô tả rõ khái niệm kỹ thuật, mục đích sử dụng, dữ liệu đầu vào/đầu ra và giá trị thực tiễn mang lại:</w:t>
       </w:r>
     </w:p>
     <w:tbl>
@@ -373,14 +218,16 @@
         <w:tblLook w:firstColumn="1" w:firstRow="1" w:lastColumn="0" w:lastRow="0" w:noHBand="0" w:noVBand="1" w:val="04A0"/>
       </w:tblPr>
       <w:tblGrid>
-        <w:gridCol w:w="3312"/>
-        <w:gridCol w:w="3312"/>
-        <w:gridCol w:w="3312"/>
+        <w:gridCol w:w="1987"/>
+        <w:gridCol w:w="1987"/>
+        <w:gridCol w:w="1987"/>
+        <w:gridCol w:w="1987"/>
+        <w:gridCol w:w="1987"/>
       </w:tblGrid>
       <w:tr>
         <w:tc>
           <w:tcPr>
-            <w:tcW w:type="dxa" w:w="3312"/>
+            <w:tcW w:type="dxa" w:w="1987"/>
             <w:shd w:fill="065f46"/>
           </w:tcPr>
           <w:p>
@@ -389,13 +236,13 @@
                 <w:b/>
                 <w:color w:val="FFFFFF"/>
               </w:rPr>
-              <w:t>Phân Hệ</w:t>
+              <w:t>STT</w:t>
             </w:r>
           </w:p>
         </w:tc>
         <w:tc>
           <w:tcPr>
-            <w:tcW w:type="dxa" w:w="3312"/>
+            <w:tcW w:type="dxa" w:w="1987"/>
             <w:shd w:fill="065f46"/>
           </w:tcPr>
           <w:p>
@@ -404,13 +251,13 @@
                 <w:b/>
                 <w:color w:val="FFFFFF"/>
               </w:rPr>
-              <w:t>Công Nghệ Nền Tảng</w:t>
+              <w:t>Tên Tính Năng</w:t>
             </w:r>
           </w:p>
         </w:tc>
         <w:tc>
           <w:tcPr>
-            <w:tcW w:type="dxa" w:w="3312"/>
+            <w:tcW w:type="dxa" w:w="1987"/>
             <w:shd w:fill="065f46"/>
           </w:tcPr>
           <w:p>
@@ -419,7 +266,37 @@
                 <w:b/>
                 <w:color w:val="FFFFFF"/>
               </w:rPr>
-              <w:t>Thư Viện &amp; Công Cụ Tích Hợp</w:t>
+              <w:t>Khái Niệm Kỹ Thuật</w:t>
+            </w:r>
+          </w:p>
+        </w:tc>
+        <w:tc>
+          <w:tcPr>
+            <w:tcW w:type="dxa" w:w="1987"/>
+            <w:shd w:fill="065f46"/>
+          </w:tcPr>
+          <w:p>
+            <w:r>
+              <w:rPr>
+                <w:b/>
+                <w:color w:val="FFFFFF"/>
+              </w:rPr>
+              <w:t>Mục Đích Sử Dụng</w:t>
+            </w:r>
+          </w:p>
+        </w:tc>
+        <w:tc>
+          <w:tcPr>
+            <w:tcW w:type="dxa" w:w="1987"/>
+            <w:shd w:fill="065f46"/>
+          </w:tcPr>
+          <w:p>
+            <w:r>
+              <w:rPr>
+                <w:b/>
+                <w:color w:val="FFFFFF"/>
+              </w:rPr>
+              <w:t>Đầu Vào / Đầu Ra &amp; Giá Trị</w:t>
             </w:r>
           </w:p>
         </w:tc>
@@ -427,52 +304,86 @@
       <w:tr>
         <w:tc>
           <w:tcPr>
-            <w:tcW w:type="dxa" w:w="3312"/>
+            <w:tcW w:type="dxa" w:w="1987"/>
             <w:shd w:fill="f8fafc"/>
             <w:tcMar>
-              <w:top w:w="80" w:type="dxa"/>
-              <w:bottom w:w="80" w:type="dxa"/>
-              <w:left w:w="100" w:type="dxa"/>
-              <w:right w:w="100" w:type="dxa"/>
+              <w:top w:w="60" w:type="dxa"/>
+              <w:bottom w:w="60" w:type="dxa"/>
+              <w:left w:w="80" w:type="dxa"/>
+              <w:right w:w="80" w:type="dxa"/>
             </w:tcMar>
           </w:tcPr>
           <w:p>
             <w:r>
-              <w:t>Backend API Server</w:t>
+              <w:t>1</w:t>
             </w:r>
           </w:p>
         </w:tc>
         <w:tc>
           <w:tcPr>
-            <w:tcW w:type="dxa" w:w="3312"/>
+            <w:tcW w:type="dxa" w:w="1987"/>
             <w:shd w:fill="f8fafc"/>
             <w:tcMar>
-              <w:top w:w="80" w:type="dxa"/>
-              <w:bottom w:w="80" w:type="dxa"/>
-              <w:left w:w="100" w:type="dxa"/>
-              <w:right w:w="100" w:type="dxa"/>
+              <w:top w:w="60" w:type="dxa"/>
+              <w:bottom w:w="60" w:type="dxa"/>
+              <w:left w:w="80" w:type="dxa"/>
+              <w:right w:w="80" w:type="dxa"/>
             </w:tcMar>
           </w:tcPr>
           <w:p>
             <w:r>
-              <w:t>Node.js, Express.js, WebSocket (ws)</w:t>
+              <w:t>Phân hệ Bản đồ GIS 3D Satellite</w:t>
             </w:r>
           </w:p>
         </w:tc>
         <w:tc>
           <w:tcPr>
-            <w:tcW w:type="dxa" w:w="3312"/>
+            <w:tcW w:type="dxa" w:w="1987"/>
             <w:shd w:fill="f8fafc"/>
             <w:tcMar>
-              <w:top w:w="80" w:type="dxa"/>
-              <w:bottom w:w="80" w:type="dxa"/>
-              <w:left w:w="100" w:type="dxa"/>
-              <w:right w:w="100" w:type="dxa"/>
+              <w:top w:w="60" w:type="dxa"/>
+              <w:bottom w:w="60" w:type="dxa"/>
+              <w:left w:w="80" w:type="dxa"/>
+              <w:right w:w="80" w:type="dxa"/>
             </w:tcMar>
           </w:tcPr>
           <w:p>
             <w:r>
-              <w:t>better-sqlite3 / PostgreSQL, JWT Auth, bcrypt, dotenv</w:t>
+              <w:t>Bản đồ không gian vệ tinh tích hợp đa giác Polygon định dạng GeoJSON.</w:t>
+            </w:r>
+          </w:p>
+        </w:tc>
+        <w:tc>
+          <w:tcPr>
+            <w:tcW w:type="dxa" w:w="1987"/>
+            <w:shd w:fill="f8fafc"/>
+            <w:tcMar>
+              <w:top w:w="60" w:type="dxa"/>
+              <w:bottom w:w="60" w:type="dxa"/>
+              <w:left w:w="80" w:type="dxa"/>
+              <w:right w:w="80" w:type="dxa"/>
+            </w:tcMar>
+          </w:tcPr>
+          <w:p>
+            <w:r>
+              <w:t>Quản lý ranh giới vị trí địa lý trang trại trực quan trên bản đồ số.</w:t>
+            </w:r>
+          </w:p>
+        </w:tc>
+        <w:tc>
+          <w:tcPr>
+            <w:tcW w:type="dxa" w:w="1987"/>
+            <w:shd w:fill="f8fafc"/>
+            <w:tcMar>
+              <w:top w:w="60" w:type="dxa"/>
+              <w:bottom w:w="60" w:type="dxa"/>
+              <w:left w:w="80" w:type="dxa"/>
+              <w:right w:w="80" w:type="dxa"/>
+            </w:tcMar>
+          </w:tcPr>
+          <w:p>
+            <w:r>
+              <w:t>Input: Tọa độ GPS -&gt; Output: Đa giác ranh giới. Tránh tranh chấp đất đai.</w:t>
             </w:r>
           </w:p>
         </w:tc>
@@ -480,52 +391,86 @@
       <w:tr>
         <w:tc>
           <w:tcPr>
-            <w:tcW w:type="dxa" w:w="3312"/>
+            <w:tcW w:type="dxa" w:w="1987"/>
             <w:shd w:fill="ffffff"/>
             <w:tcMar>
-              <w:top w:w="80" w:type="dxa"/>
-              <w:bottom w:w="80" w:type="dxa"/>
-              <w:left w:w="100" w:type="dxa"/>
-              <w:right w:w="100" w:type="dxa"/>
+              <w:top w:w="60" w:type="dxa"/>
+              <w:bottom w:w="60" w:type="dxa"/>
+              <w:left w:w="80" w:type="dxa"/>
+              <w:right w:w="80" w:type="dxa"/>
             </w:tcMar>
           </w:tcPr>
           <w:p>
             <w:r>
-              <w:t>Frontend Admin Portal</w:t>
+              <w:t>2</w:t>
             </w:r>
           </w:p>
         </w:tc>
         <w:tc>
           <w:tcPr>
-            <w:tcW w:type="dxa" w:w="3312"/>
+            <w:tcW w:type="dxa" w:w="1987"/>
             <w:shd w:fill="ffffff"/>
             <w:tcMar>
-              <w:top w:w="80" w:type="dxa"/>
-              <w:bottom w:w="80" w:type="dxa"/>
-              <w:left w:w="100" w:type="dxa"/>
-              <w:right w:w="100" w:type="dxa"/>
+              <w:top w:w="60" w:type="dxa"/>
+              <w:bottom w:w="60" w:type="dxa"/>
+              <w:left w:w="80" w:type="dxa"/>
+              <w:right w:w="80" w:type="dxa"/>
             </w:tcMar>
           </w:tcPr>
           <w:p>
             <w:r>
-              <w:t>HTML5, Vanilla JS (ES Modules), CSS3</w:t>
+              <w:t>Trích xuất Đường Đồng Mức DEM 100% Real</w:t>
             </w:r>
           </w:p>
         </w:tc>
         <w:tc>
           <w:tcPr>
-            <w:tcW w:type="dxa" w:w="3312"/>
+            <w:tcW w:type="dxa" w:w="1987"/>
             <w:shd w:fill="ffffff"/>
             <w:tcMar>
-              <w:top w:w="80" w:type="dxa"/>
-              <w:bottom w:w="80" w:type="dxa"/>
-              <w:left w:w="100" w:type="dxa"/>
-              <w:right w:w="100" w:type="dxa"/>
+              <w:top w:w="60" w:type="dxa"/>
+              <w:bottom w:w="60" w:type="dxa"/>
+              <w:left w:w="80" w:type="dxa"/>
+              <w:right w:w="80" w:type="dxa"/>
             </w:tcMar>
           </w:tcPr>
           <w:p>
             <w:r>
-              <w:t>Mapbox GL JS v3, Turf.js, html2pdf.js, FontAwesome 6</w:t>
+              <w:t>Thuật toán Marching Squares trích xuất lưới độ cao từ Mapbox Terrain-DEM.</w:t>
+            </w:r>
+          </w:p>
+        </w:tc>
+        <w:tc>
+          <w:tcPr>
+            <w:tcW w:type="dxa" w:w="1987"/>
+            <w:shd w:fill="ffffff"/>
+            <w:tcMar>
+              <w:top w:w="60" w:type="dxa"/>
+              <w:bottom w:w="60" w:type="dxa"/>
+              <w:left w:w="80" w:type="dxa"/>
+              <w:right w:w="80" w:type="dxa"/>
+            </w:tcMar>
+          </w:tcPr>
+          <w:p>
+            <w:r>
+              <w:t>Phân tích địa hình, độ dốc, thiết kế hướng thoát nước &amp; chống sạt lở.</w:t>
+            </w:r>
+          </w:p>
+        </w:tc>
+        <w:tc>
+          <w:tcPr>
+            <w:tcW w:type="dxa" w:w="1987"/>
+            <w:shd w:fill="ffffff"/>
+            <w:tcMar>
+              <w:top w:w="60" w:type="dxa"/>
+              <w:bottom w:w="60" w:type="dxa"/>
+              <w:left w:w="80" w:type="dxa"/>
+              <w:right w:w="80" w:type="dxa"/>
+            </w:tcMar>
+          </w:tcPr>
+          <w:p>
+            <w:r>
+              <w:t>Input: Lưới cao độ -&gt; Output: Dải bình độ 1m/5m &amp; màu nhiệt cao độ.</w:t>
             </w:r>
           </w:p>
         </w:tc>
@@ -533,52 +478,86 @@
       <w:tr>
         <w:tc>
           <w:tcPr>
-            <w:tcW w:type="dxa" w:w="3312"/>
+            <w:tcW w:type="dxa" w:w="1987"/>
             <w:shd w:fill="f8fafc"/>
             <w:tcMar>
-              <w:top w:w="80" w:type="dxa"/>
-              <w:bottom w:w="80" w:type="dxa"/>
-              <w:left w:w="100" w:type="dxa"/>
-              <w:right w:w="100" w:type="dxa"/>
+              <w:top w:w="60" w:type="dxa"/>
+              <w:bottom w:w="60" w:type="dxa"/>
+              <w:left w:w="80" w:type="dxa"/>
+              <w:right w:w="80" w:type="dxa"/>
             </w:tcMar>
           </w:tcPr>
           <w:p>
             <w:r>
-              <w:t>Frontend User Portal</w:t>
+              <w:t>3</w:t>
             </w:r>
           </w:p>
         </w:tc>
         <w:tc>
           <w:tcPr>
-            <w:tcW w:type="dxa" w:w="3312"/>
+            <w:tcW w:type="dxa" w:w="1987"/>
             <w:shd w:fill="f8fafc"/>
             <w:tcMar>
-              <w:top w:w="80" w:type="dxa"/>
-              <w:bottom w:w="80" w:type="dxa"/>
-              <w:left w:w="100" w:type="dxa"/>
-              <w:right w:w="100" w:type="dxa"/>
+              <w:top w:w="60" w:type="dxa"/>
+              <w:bottom w:w="60" w:type="dxa"/>
+              <w:left w:w="80" w:type="dxa"/>
+              <w:right w:w="80" w:type="dxa"/>
             </w:tcMar>
           </w:tcPr>
           <w:p>
             <w:r>
-              <w:t>HTML5 Mobile-First Responsive, Single Page App</w:t>
+              <w:t>Nhãn Số Cao Độ Mẹ Nổi Bật (Major Labels)</w:t>
             </w:r>
           </w:p>
         </w:tc>
         <w:tc>
           <w:tcPr>
-            <w:tcW w:type="dxa" w:w="3312"/>
+            <w:tcW w:type="dxa" w:w="1987"/>
             <w:shd w:fill="f8fafc"/>
             <w:tcMar>
-              <w:top w:w="80" w:type="dxa"/>
-              <w:bottom w:w="80" w:type="dxa"/>
-              <w:left w:w="100" w:type="dxa"/>
-              <w:right w:w="100" w:type="dxa"/>
+              <w:top w:w="60" w:type="dxa"/>
+              <w:bottom w:w="60" w:type="dxa"/>
+              <w:left w:w="80" w:type="dxa"/>
+              <w:right w:w="80" w:type="dxa"/>
             </w:tcMar>
           </w:tcPr>
           <w:p>
             <w:r>
-              <w:t>Mapbox GL JS, Web NFC API, FontAwesome 6</w:t>
+              <w:t>Lớp text glyphs (14px bold) đè đè lên đường bình độ cái (% 5 === 0).</w:t>
+            </w:r>
+          </w:p>
+        </w:tc>
+        <w:tc>
+          <w:tcPr>
+            <w:tcW w:type="dxa" w:w="1987"/>
+            <w:shd w:fill="f8fafc"/>
+            <w:tcMar>
+              <w:top w:w="60" w:type="dxa"/>
+              <w:bottom w:w="60" w:type="dxa"/>
+              <w:left w:w="80" w:type="dxa"/>
+              <w:right w:w="80" w:type="dxa"/>
+            </w:tcMar>
+          </w:tcPr>
+          <w:p>
+            <w:r>
+              <w:t>Hiển thị rõ ràng con số cao độ (VD: 740m, 745m) giúp kỹ sư soi địa hình.</w:t>
+            </w:r>
+          </w:p>
+        </w:tc>
+        <w:tc>
+          <w:tcPr>
+            <w:tcW w:type="dxa" w:w="1987"/>
+            <w:shd w:fill="f8fafc"/>
+            <w:tcMar>
+              <w:top w:w="60" w:type="dxa"/>
+              <w:bottom w:w="60" w:type="dxa"/>
+              <w:left w:w="80" w:type="dxa"/>
+              <w:right w:w="80" w:type="dxa"/>
+            </w:tcMar>
+          </w:tcPr>
+          <w:p>
+            <w:r>
+              <w:t>Input: Dữ liệu ele -&gt; Output: Nhãn số nổi bật không bị che khuất.</w:t>
             </w:r>
           </w:p>
         </w:tc>
@@ -586,52 +565,869 @@
       <w:tr>
         <w:tc>
           <w:tcPr>
-            <w:tcW w:type="dxa" w:w="3312"/>
+            <w:tcW w:type="dxa" w:w="1987"/>
             <w:shd w:fill="ffffff"/>
             <w:tcMar>
-              <w:top w:w="80" w:type="dxa"/>
-              <w:bottom w:w="80" w:type="dxa"/>
-              <w:left w:w="100" w:type="dxa"/>
-              <w:right w:w="100" w:type="dxa"/>
+              <w:top w:w="60" w:type="dxa"/>
+              <w:bottom w:w="60" w:type="dxa"/>
+              <w:left w:w="80" w:type="dxa"/>
+              <w:right w:w="80" w:type="dxa"/>
             </w:tcMar>
           </w:tcPr>
           <w:p>
             <w:r>
-              <w:t>Public Origin Tracing</w:t>
+              <w:t>4</w:t>
             </w:r>
           </w:p>
         </w:tc>
         <w:tc>
           <w:tcPr>
-            <w:tcW w:type="dxa" w:w="3312"/>
+            <w:tcW w:type="dxa" w:w="1987"/>
             <w:shd w:fill="ffffff"/>
             <w:tcMar>
-              <w:top w:w="80" w:type="dxa"/>
-              <w:bottom w:w="80" w:type="dxa"/>
-              <w:left w:w="100" w:type="dxa"/>
-              <w:right w:w="100" w:type="dxa"/>
+              <w:top w:w="60" w:type="dxa"/>
+              <w:bottom w:w="60" w:type="dxa"/>
+              <w:left w:w="80" w:type="dxa"/>
+              <w:right w:w="80" w:type="dxa"/>
             </w:tcMar>
           </w:tcPr>
           <w:p>
             <w:r>
-              <w:t>Responsive Web Page (No Auth required)</w:t>
+              <w:t>Bộ Đo Kích Thước Ranh Giới Kỹ Thuật</w:t>
             </w:r>
           </w:p>
         </w:tc>
         <w:tc>
           <w:tcPr>
-            <w:tcW w:type="dxa" w:w="3312"/>
+            <w:tcW w:type="dxa" w:w="1987"/>
             <w:shd w:fill="ffffff"/>
             <w:tcMar>
-              <w:top w:w="80" w:type="dxa"/>
-              <w:bottom w:w="80" w:type="dxa"/>
-              <w:left w:w="100" w:type="dxa"/>
-              <w:right w:w="100" w:type="dxa"/>
+              <w:top w:w="60" w:type="dxa"/>
+              <w:bottom w:w="60" w:type="dxa"/>
+              <w:left w:w="80" w:type="dxa"/>
+              <w:right w:w="80" w:type="dxa"/>
             </w:tcMar>
           </w:tcPr>
           <w:p>
             <w:r>
-              <w:t>Mapbox GL JS, Dynamic QR/NFC Passport Router</w:t>
+              <w:t>Thuật toán Turf.js geodesic đo khoảng cách giữa các đỉnh ranh giới.</w:t>
+            </w:r>
+          </w:p>
+        </w:tc>
+        <w:tc>
+          <w:tcPr>
+            <w:tcW w:type="dxa" w:w="1987"/>
+            <w:shd w:fill="ffffff"/>
+            <w:tcMar>
+              <w:top w:w="60" w:type="dxa"/>
+              <w:bottom w:w="60" w:type="dxa"/>
+              <w:left w:w="80" w:type="dxa"/>
+              <w:right w:w="80" w:type="dxa"/>
+            </w:tcMar>
+          </w:tcPr>
+          <w:p>
+            <w:r>
+              <w:t>Đánh tên mốc A,B,C... đo chiều dài từng cạnh ranh giới, diện tích (m²) &amp; chu vi.</w:t>
+            </w:r>
+          </w:p>
+        </w:tc>
+        <w:tc>
+          <w:tcPr>
+            <w:tcW w:type="dxa" w:w="1987"/>
+            <w:shd w:fill="ffffff"/>
+            <w:tcMar>
+              <w:top w:w="60" w:type="dxa"/>
+              <w:bottom w:w="60" w:type="dxa"/>
+              <w:left w:w="80" w:type="dxa"/>
+              <w:right w:w="80" w:type="dxa"/>
+            </w:tcMar>
+          </w:tcPr>
+          <w:p>
+            <w:r>
+              <w:t>Input: Các mốc góc -&gt; Output: Huy hiệu 📏 AB: 285.4m, Chu vi, Diện tích.</w:t>
+            </w:r>
+          </w:p>
+        </w:tc>
+      </w:tr>
+      <w:tr>
+        <w:tc>
+          <w:tcPr>
+            <w:tcW w:type="dxa" w:w="1987"/>
+            <w:shd w:fill="f8fafc"/>
+            <w:tcMar>
+              <w:top w:w="60" w:type="dxa"/>
+              <w:bottom w:w="60" w:type="dxa"/>
+              <w:left w:w="80" w:type="dxa"/>
+              <w:right w:w="80" w:type="dxa"/>
+            </w:tcMar>
+          </w:tcPr>
+          <w:p>
+            <w:r>
+              <w:t>5</w:t>
+            </w:r>
+          </w:p>
+        </w:tc>
+        <w:tc>
+          <w:tcPr>
+            <w:tcW w:type="dxa" w:w="1987"/>
+            <w:shd w:fill="f8fafc"/>
+            <w:tcMar>
+              <w:top w:w="60" w:type="dxa"/>
+              <w:bottom w:w="60" w:type="dxa"/>
+              <w:left w:w="80" w:type="dxa"/>
+              <w:right w:w="80" w:type="dxa"/>
+            </w:tcMar>
+          </w:tcPr>
+          <w:p>
+            <w:r>
+              <w:t>Lọc Nhiễu 0.0m &amp; Khép Góc Ranh Giới</w:t>
+            </w:r>
+          </w:p>
+        </w:tc>
+        <w:tc>
+          <w:tcPr>
+            <w:tcW w:type="dxa" w:w="1987"/>
+            <w:shd w:fill="f8fafc"/>
+            <w:tcMar>
+              <w:top w:w="60" w:type="dxa"/>
+              <w:bottom w:w="60" w:type="dxa"/>
+              <w:left w:w="80" w:type="dxa"/>
+              <w:right w:w="80" w:type="dxa"/>
+            </w:tcMar>
+          </w:tcPr>
+          <w:p>
+            <w:r>
+              <w:t>Lọc các mốc trùng nhau &lt;0.2m, ẩn nhãn ghim đoạn khép góc cuối trên map.</w:t>
+            </w:r>
+          </w:p>
+        </w:tc>
+        <w:tc>
+          <w:tcPr>
+            <w:tcW w:type="dxa" w:w="1987"/>
+            <w:shd w:fill="f8fafc"/>
+            <w:tcMar>
+              <w:top w:w="60" w:type="dxa"/>
+              <w:bottom w:w="60" w:type="dxa"/>
+              <w:left w:w="80" w:type="dxa"/>
+              <w:right w:w="80" w:type="dxa"/>
+            </w:tcMar>
+          </w:tcPr>
+          <w:p>
+            <w:r>
+              <w:t>Giữ bản đồ sạch sẽ không bị rối mắt trong khi bảng tính toán vẫn đúng 100%.</w:t>
+            </w:r>
+          </w:p>
+        </w:tc>
+        <w:tc>
+          <w:tcPr>
+            <w:tcW w:type="dxa" w:w="1987"/>
+            <w:shd w:fill="f8fafc"/>
+            <w:tcMar>
+              <w:top w:w="60" w:type="dxa"/>
+              <w:bottom w:w="60" w:type="dxa"/>
+              <w:left w:w="80" w:type="dxa"/>
+              <w:right w:w="80" w:type="dxa"/>
+            </w:tcMar>
+          </w:tcPr>
+          <w:p>
+            <w:r>
+              <w:t>Input: Polygon ranh giới -&gt; Output: Bản đồ thông thoáng, math chuẩn xác.</w:t>
+            </w:r>
+          </w:p>
+        </w:tc>
+      </w:tr>
+      <w:tr>
+        <w:tc>
+          <w:tcPr>
+            <w:tcW w:type="dxa" w:w="1987"/>
+            <w:shd w:fill="ffffff"/>
+            <w:tcMar>
+              <w:top w:w="60" w:type="dxa"/>
+              <w:bottom w:w="60" w:type="dxa"/>
+              <w:left w:w="80" w:type="dxa"/>
+              <w:right w:w="80" w:type="dxa"/>
+            </w:tcMar>
+          </w:tcPr>
+          <w:p>
+            <w:r>
+              <w:t>6</w:t>
+            </w:r>
+          </w:p>
+        </w:tc>
+        <w:tc>
+          <w:tcPr>
+            <w:tcW w:type="dxa" w:w="1987"/>
+            <w:shd w:fill="ffffff"/>
+            <w:tcMar>
+              <w:top w:w="60" w:type="dxa"/>
+              <w:bottom w:w="60" w:type="dxa"/>
+              <w:left w:w="80" w:type="dxa"/>
+              <w:right w:w="80" w:type="dxa"/>
+            </w:tcMar>
+          </w:tcPr>
+          <w:p>
+            <w:r>
+              <w:t>Xuất Hồ Sơ Bản Vẽ CAD A4 Nằm Ngang</w:t>
+            </w:r>
+          </w:p>
+        </w:tc>
+        <w:tc>
+          <w:tcPr>
+            <w:tcW w:type="dxa" w:w="1987"/>
+            <w:shd w:fill="ffffff"/>
+            <w:tcMar>
+              <w:top w:w="60" w:type="dxa"/>
+              <w:bottom w:w="60" w:type="dxa"/>
+              <w:left w:w="80" w:type="dxa"/>
+              <w:right w:w="80" w:type="dxa"/>
+            </w:tcMar>
+          </w:tcPr>
+          <w:p>
+            <w:r>
+              <w:t>Engine chụp canvas WebGL &amp; render mẫu bản vẽ kỹ thuật A4 chuẩn tỷ lệ 1:1.</w:t>
+            </w:r>
+          </w:p>
+        </w:tc>
+        <w:tc>
+          <w:tcPr>
+            <w:tcW w:type="dxa" w:w="1987"/>
+            <w:shd w:fill="ffffff"/>
+            <w:tcMar>
+              <w:top w:w="60" w:type="dxa"/>
+              <w:bottom w:w="60" w:type="dxa"/>
+              <w:left w:w="80" w:type="dxa"/>
+              <w:right w:w="80" w:type="dxa"/>
+            </w:tcMar>
+          </w:tcPr>
+          <w:p>
+            <w:r>
+              <w:t>Xuất hồ sơ bản vẽ địa hình trang trại phục vụ lưu trữ, nộp cơ quan hoặc in ấn.</w:t>
+            </w:r>
+          </w:p>
+        </w:tc>
+        <w:tc>
+          <w:tcPr>
+            <w:tcW w:type="dxa" w:w="1987"/>
+            <w:shd w:fill="ffffff"/>
+            <w:tcMar>
+              <w:top w:w="60" w:type="dxa"/>
+              <w:bottom w:w="60" w:type="dxa"/>
+              <w:left w:w="80" w:type="dxa"/>
+              <w:right w:w="80" w:type="dxa"/>
+            </w:tcMar>
+          </w:tcPr>
+          <w:p>
+            <w:r>
+              <w:t>Input: Data GIS -&gt; Output: Tệp PDF / Bản in A4 chuẩn doanh nghiệp.</w:t>
+            </w:r>
+          </w:p>
+        </w:tc>
+      </w:tr>
+      <w:tr>
+        <w:tc>
+          <w:tcPr>
+            <w:tcW w:type="dxa" w:w="1987"/>
+            <w:shd w:fill="f8fafc"/>
+            <w:tcMar>
+              <w:top w:w="60" w:type="dxa"/>
+              <w:bottom w:w="60" w:type="dxa"/>
+              <w:left w:w="80" w:type="dxa"/>
+              <w:right w:w="80" w:type="dxa"/>
+            </w:tcMar>
+          </w:tcPr>
+          <w:p>
+            <w:r>
+              <w:t>7</w:t>
+            </w:r>
+          </w:p>
+        </w:tc>
+        <w:tc>
+          <w:tcPr>
+            <w:tcW w:type="dxa" w:w="1987"/>
+            <w:shd w:fill="f8fafc"/>
+            <w:tcMar>
+              <w:top w:w="60" w:type="dxa"/>
+              <w:bottom w:w="60" w:type="dxa"/>
+              <w:left w:w="80" w:type="dxa"/>
+              <w:right w:w="80" w:type="dxa"/>
+            </w:tcMar>
+          </w:tcPr>
+          <w:p>
+            <w:r>
+              <w:t>Tùy Chỉnh Linh Hoạt 100% Bản Vẽ A4</w:t>
+            </w:r>
+          </w:p>
+        </w:tc>
+        <w:tc>
+          <w:tcPr>
+            <w:tcW w:type="dxa" w:w="1987"/>
+            <w:shd w:fill="f8fafc"/>
+            <w:tcMar>
+              <w:top w:w="60" w:type="dxa"/>
+              <w:bottom w:w="60" w:type="dxa"/>
+              <w:left w:w="80" w:type="dxa"/>
+              <w:right w:w="80" w:type="dxa"/>
+            </w:tcMar>
+          </w:tcPr>
+          <w:p>
+            <w:r>
+              <w:t>Chuyển tất cả chữ/số trên Form A4 thành ô nhập liệu .a4-edit-field.</w:t>
+            </w:r>
+          </w:p>
+        </w:tc>
+        <w:tc>
+          <w:tcPr>
+            <w:tcW w:type="dxa" w:w="1987"/>
+            <w:shd w:fill="f8fafc"/>
+            <w:tcMar>
+              <w:top w:w="60" w:type="dxa"/>
+              <w:bottom w:w="60" w:type="dxa"/>
+              <w:left w:w="80" w:type="dxa"/>
+              <w:right w:w="80" w:type="dxa"/>
+            </w:tcMar>
+          </w:tcPr>
+          <w:p>
+            <w:r>
+              <w:t>Cho phép người dùng tự do click vào chỉnh tên trang trại, khách hàng, kích thước.</w:t>
+            </w:r>
+          </w:p>
+        </w:tc>
+        <w:tc>
+          <w:tcPr>
+            <w:tcW w:type="dxa" w:w="1987"/>
+            <w:shd w:fill="f8fafc"/>
+            <w:tcMar>
+              <w:top w:w="60" w:type="dxa"/>
+              <w:bottom w:w="60" w:type="dxa"/>
+              <w:left w:w="80" w:type="dxa"/>
+              <w:right w:w="80" w:type="dxa"/>
+            </w:tcMar>
+          </w:tcPr>
+          <w:p>
+            <w:r>
+              <w:t>Input: Thao tác click -&gt; Output: Nội dung A4 tùy biến trước khi xuất.</w:t>
+            </w:r>
+          </w:p>
+        </w:tc>
+      </w:tr>
+      <w:tr>
+        <w:tc>
+          <w:tcPr>
+            <w:tcW w:type="dxa" w:w="1987"/>
+            <w:shd w:fill="ffffff"/>
+            <w:tcMar>
+              <w:top w:w="60" w:type="dxa"/>
+              <w:bottom w:w="60" w:type="dxa"/>
+              <w:left w:w="80" w:type="dxa"/>
+              <w:right w:w="80" w:type="dxa"/>
+            </w:tcMar>
+          </w:tcPr>
+          <w:p>
+            <w:r>
+              <w:t>8</w:t>
+            </w:r>
+          </w:p>
+        </w:tc>
+        <w:tc>
+          <w:tcPr>
+            <w:tcW w:type="dxa" w:w="1987"/>
+            <w:shd w:fill="ffffff"/>
+            <w:tcMar>
+              <w:top w:w="60" w:type="dxa"/>
+              <w:bottom w:w="60" w:type="dxa"/>
+              <w:left w:w="80" w:type="dxa"/>
+              <w:right w:w="80" w:type="dxa"/>
+            </w:tcMar>
+          </w:tcPr>
+          <w:p>
+            <w:r>
+              <w:t>Import Bản Vẽ Thiết Kế CAD / Image Overlay</w:t>
+            </w:r>
+          </w:p>
+        </w:tc>
+        <w:tc>
+          <w:tcPr>
+            <w:tcW w:type="dxa" w:w="1987"/>
+            <w:shd w:fill="ffffff"/>
+            <w:tcMar>
+              <w:top w:w="60" w:type="dxa"/>
+              <w:bottom w:w="60" w:type="dxa"/>
+              <w:left w:w="80" w:type="dxa"/>
+              <w:right w:w="80" w:type="dxa"/>
+            </w:tcMar>
+          </w:tcPr>
+          <w:p>
+            <w:r>
+              <w:t>Modal nạp file vector (.geojson, .kml, .dxf) hoặc ảnh sơ đồ (.png, .jpg).</w:t>
+            </w:r>
+          </w:p>
+        </w:tc>
+        <w:tc>
+          <w:tcPr>
+            <w:tcW w:type="dxa" w:w="1987"/>
+            <w:shd w:fill="ffffff"/>
+            <w:tcMar>
+              <w:top w:w="60" w:type="dxa"/>
+              <w:bottom w:w="60" w:type="dxa"/>
+              <w:left w:w="80" w:type="dxa"/>
+              <w:right w:w="80" w:type="dxa"/>
+            </w:tcMar>
+          </w:tcPr>
+          <w:p>
+            <w:r>
+              <w:t>Phủ bản vẽ quy hoạch kiến trúc/hệ thống tưới lên nền bản đồ vệ tinh.</w:t>
+            </w:r>
+          </w:p>
+        </w:tc>
+        <w:tc>
+          <w:tcPr>
+            <w:tcW w:type="dxa" w:w="1987"/>
+            <w:shd w:fill="ffffff"/>
+            <w:tcMar>
+              <w:top w:w="60" w:type="dxa"/>
+              <w:bottom w:w="60" w:type="dxa"/>
+              <w:left w:w="80" w:type="dxa"/>
+              <w:right w:w="80" w:type="dxa"/>
+            </w:tcMar>
+          </w:tcPr>
+          <w:p>
+            <w:r>
+              <w:t>Input: File CAD/Ảnh -&gt; Output: Lớp phủ overlay có điều chỉnh Opacity.</w:t>
+            </w:r>
+          </w:p>
+        </w:tc>
+      </w:tr>
+      <w:tr>
+        <w:tc>
+          <w:tcPr>
+            <w:tcW w:type="dxa" w:w="1987"/>
+            <w:shd w:fill="f8fafc"/>
+            <w:tcMar>
+              <w:top w:w="60" w:type="dxa"/>
+              <w:bottom w:w="60" w:type="dxa"/>
+              <w:left w:w="80" w:type="dxa"/>
+              <w:right w:w="80" w:type="dxa"/>
+            </w:tcMar>
+          </w:tcPr>
+          <w:p>
+            <w:r>
+              <w:t>9</w:t>
+            </w:r>
+          </w:p>
+        </w:tc>
+        <w:tc>
+          <w:tcPr>
+            <w:tcW w:type="dxa" w:w="1987"/>
+            <w:shd w:fill="f8fafc"/>
+            <w:tcMar>
+              <w:top w:w="60" w:type="dxa"/>
+              <w:bottom w:w="60" w:type="dxa"/>
+              <w:left w:w="80" w:type="dxa"/>
+              <w:right w:w="80" w:type="dxa"/>
+            </w:tcMar>
+          </w:tcPr>
+          <w:p>
+            <w:r>
+              <w:t>Hiện/Ẩn Vị Trí Cây Trồng (Plant Toggle)</w:t>
+            </w:r>
+          </w:p>
+        </w:tc>
+        <w:tc>
+          <w:tcPr>
+            <w:tcW w:type="dxa" w:w="1987"/>
+            <w:shd w:fill="f8fafc"/>
+            <w:tcMar>
+              <w:top w:w="60" w:type="dxa"/>
+              <w:bottom w:w="60" w:type="dxa"/>
+              <w:left w:w="80" w:type="dxa"/>
+              <w:right w:w="80" w:type="dxa"/>
+            </w:tcMar>
+          </w:tcPr>
+          <w:p>
+            <w:r>
+              <w:t>Nút toggle công tắc ẩn/hiện đồng loạt các ghim cây trồng trên bản đồ.</w:t>
+            </w:r>
+          </w:p>
+        </w:tc>
+        <w:tc>
+          <w:tcPr>
+            <w:tcW w:type="dxa" w:w="1987"/>
+            <w:shd w:fill="f8fafc"/>
+            <w:tcMar>
+              <w:top w:w="60" w:type="dxa"/>
+              <w:bottom w:w="60" w:type="dxa"/>
+              <w:left w:w="80" w:type="dxa"/>
+              <w:right w:w="80" w:type="dxa"/>
+            </w:tcMar>
+          </w:tcPr>
+          <w:p>
+            <w:r>
+              <w:t>Dễ dàng chuyển đổi giữa chế độ soi địa hình trang trại và quản lý từng cây.</w:t>
+            </w:r>
+          </w:p>
+        </w:tc>
+        <w:tc>
+          <w:tcPr>
+            <w:tcW w:type="dxa" w:w="1987"/>
+            <w:shd w:fill="f8fafc"/>
+            <w:tcMar>
+              <w:top w:w="60" w:type="dxa"/>
+              <w:bottom w:w="60" w:type="dxa"/>
+              <w:left w:w="80" w:type="dxa"/>
+              <w:right w:w="80" w:type="dxa"/>
+            </w:tcMar>
+          </w:tcPr>
+          <w:p>
+            <w:r>
+              <w:t>Input: Click Toggle -&gt; Output: Hiện/Ẩn marker ghim cây tức thì.</w:t>
+            </w:r>
+          </w:p>
+        </w:tc>
+      </w:tr>
+      <w:tr>
+        <w:tc>
+          <w:tcPr>
+            <w:tcW w:type="dxa" w:w="1987"/>
+            <w:shd w:fill="ffffff"/>
+            <w:tcMar>
+              <w:top w:w="60" w:type="dxa"/>
+              <w:bottom w:w="60" w:type="dxa"/>
+              <w:left w:w="80" w:type="dxa"/>
+              <w:right w:w="80" w:type="dxa"/>
+            </w:tcMar>
+          </w:tcPr>
+          <w:p>
+            <w:r>
+              <w:t>10</w:t>
+            </w:r>
+          </w:p>
+        </w:tc>
+        <w:tc>
+          <w:tcPr>
+            <w:tcW w:type="dxa" w:w="1987"/>
+            <w:shd w:fill="ffffff"/>
+            <w:tcMar>
+              <w:top w:w="60" w:type="dxa"/>
+              <w:bottom w:w="60" w:type="dxa"/>
+              <w:left w:w="80" w:type="dxa"/>
+              <w:right w:w="80" w:type="dxa"/>
+            </w:tcMar>
+          </w:tcPr>
+          <w:p>
+            <w:r>
+              <w:t>Sổ Cây Trồng Số &amp; Định Danh GPS</w:t>
+            </w:r>
+          </w:p>
+        </w:tc>
+        <w:tc>
+          <w:tcPr>
+            <w:tcW w:type="dxa" w:w="1987"/>
+            <w:shd w:fill="ffffff"/>
+            <w:tcMar>
+              <w:top w:w="60" w:type="dxa"/>
+              <w:bottom w:w="60" w:type="dxa"/>
+              <w:left w:w="80" w:type="dxa"/>
+              <w:right w:w="80" w:type="dxa"/>
+            </w:tcMar>
+          </w:tcPr>
+          <w:p>
+            <w:r>
+              <w:t>Mã hóa mỗi cây trồng thành 1 đối tượng digital passport có tọa độ GPS.</w:t>
+            </w:r>
+          </w:p>
+        </w:tc>
+        <w:tc>
+          <w:tcPr>
+            <w:tcW w:type="dxa" w:w="1987"/>
+            <w:shd w:fill="ffffff"/>
+            <w:tcMar>
+              <w:top w:w="60" w:type="dxa"/>
+              <w:bottom w:w="60" w:type="dxa"/>
+              <w:left w:w="80" w:type="dxa"/>
+              <w:right w:w="80" w:type="dxa"/>
+            </w:tcMar>
+          </w:tcPr>
+          <w:p>
+            <w:r>
+              <w:t>Theo dõi vị trí, loại giống, tuổi cây, tình trạng sức khỏe (Tốt/Cần chú ý/Bệnh).</w:t>
+            </w:r>
+          </w:p>
+        </w:tc>
+        <w:tc>
+          <w:tcPr>
+            <w:tcW w:type="dxa" w:w="1987"/>
+            <w:shd w:fill="ffffff"/>
+            <w:tcMar>
+              <w:top w:w="60" w:type="dxa"/>
+              <w:bottom w:w="60" w:type="dxa"/>
+              <w:left w:w="80" w:type="dxa"/>
+              <w:right w:w="80" w:type="dxa"/>
+            </w:tcMar>
+          </w:tcPr>
+          <w:p>
+            <w:r>
+              <w:t>Input: Data cây -&gt; Output: Ghim màu hiển thị mã cây ngắn (1, 58...).</w:t>
+            </w:r>
+          </w:p>
+        </w:tc>
+      </w:tr>
+      <w:tr>
+        <w:tc>
+          <w:tcPr>
+            <w:tcW w:type="dxa" w:w="1987"/>
+            <w:shd w:fill="f8fafc"/>
+            <w:tcMar>
+              <w:top w:w="60" w:type="dxa"/>
+              <w:bottom w:w="60" w:type="dxa"/>
+              <w:left w:w="80" w:type="dxa"/>
+              <w:right w:w="80" w:type="dxa"/>
+            </w:tcMar>
+          </w:tcPr>
+          <w:p>
+            <w:r>
+              <w:t>11</w:t>
+            </w:r>
+          </w:p>
+        </w:tc>
+        <w:tc>
+          <w:tcPr>
+            <w:tcW w:type="dxa" w:w="1987"/>
+            <w:shd w:fill="f8fafc"/>
+            <w:tcMar>
+              <w:top w:w="60" w:type="dxa"/>
+              <w:bottom w:w="60" w:type="dxa"/>
+              <w:left w:w="80" w:type="dxa"/>
+              <w:right w:w="80" w:type="dxa"/>
+            </w:tcMar>
+          </w:tcPr>
+          <w:p>
+            <w:r>
+              <w:t>Thẻ NFC Vật Lý &amp; Truy Xuất Nguồn Gốc</w:t>
+            </w:r>
+          </w:p>
+        </w:tc>
+        <w:tc>
+          <w:tcPr>
+            <w:tcW w:type="dxa" w:w="1987"/>
+            <w:shd w:fill="f8fafc"/>
+            <w:tcMar>
+              <w:top w:w="60" w:type="dxa"/>
+              <w:bottom w:w="60" w:type="dxa"/>
+              <w:left w:w="80" w:type="dxa"/>
+              <w:right w:w="80" w:type="dxa"/>
+            </w:tcMar>
+          </w:tcPr>
+          <w:p>
+            <w:r>
+              <w:t>Tích hợp Web NFC API ghi UID cây trồng vào thẻ NFC dán trên thân cây.</w:t>
+            </w:r>
+          </w:p>
+        </w:tc>
+        <w:tc>
+          <w:tcPr>
+            <w:tcW w:type="dxa" w:w="1987"/>
+            <w:shd w:fill="f8fafc"/>
+            <w:tcMar>
+              <w:top w:w="60" w:type="dxa"/>
+              <w:bottom w:w="60" w:type="dxa"/>
+              <w:left w:w="80" w:type="dxa"/>
+              <w:right w:w="80" w:type="dxa"/>
+            </w:tcMar>
+          </w:tcPr>
+          <w:p>
+            <w:r>
+              <w:t>Truy xuất nguồn gốc công khai (/public/plant.html) khi quét NFC/QR Code.</w:t>
+            </w:r>
+          </w:p>
+        </w:tc>
+        <w:tc>
+          <w:tcPr>
+            <w:tcW w:type="dxa" w:w="1987"/>
+            <w:shd w:fill="f8fafc"/>
+            <w:tcMar>
+              <w:top w:w="60" w:type="dxa"/>
+              <w:bottom w:w="60" w:type="dxa"/>
+              <w:left w:w="80" w:type="dxa"/>
+              <w:right w:w="80" w:type="dxa"/>
+            </w:tcMar>
+          </w:tcPr>
+          <w:p>
+            <w:r>
+              <w:t>Input: Chạm NFC -&gt; Output: Mở trang Public Passport chi tiết cây.</w:t>
+            </w:r>
+          </w:p>
+        </w:tc>
+      </w:tr>
+      <w:tr>
+        <w:tc>
+          <w:tcPr>
+            <w:tcW w:type="dxa" w:w="1987"/>
+            <w:shd w:fill="ffffff"/>
+            <w:tcMar>
+              <w:top w:w="60" w:type="dxa"/>
+              <w:bottom w:w="60" w:type="dxa"/>
+              <w:left w:w="80" w:type="dxa"/>
+              <w:right w:w="80" w:type="dxa"/>
+            </w:tcMar>
+          </w:tcPr>
+          <w:p>
+            <w:r>
+              <w:t>12</w:t>
+            </w:r>
+          </w:p>
+        </w:tc>
+        <w:tc>
+          <w:tcPr>
+            <w:tcW w:type="dxa" w:w="1987"/>
+            <w:shd w:fill="ffffff"/>
+            <w:tcMar>
+              <w:top w:w="60" w:type="dxa"/>
+              <w:bottom w:w="60" w:type="dxa"/>
+              <w:left w:w="80" w:type="dxa"/>
+              <w:right w:w="80" w:type="dxa"/>
+            </w:tcMar>
+          </w:tcPr>
+          <w:p>
+            <w:r>
+              <w:t>Phân Hệ Quản Lý Vật Tư &amp; Tiêu Hao</w:t>
+            </w:r>
+          </w:p>
+        </w:tc>
+        <w:tc>
+          <w:tcPr>
+            <w:tcW w:type="dxa" w:w="1987"/>
+            <w:shd w:fill="ffffff"/>
+            <w:tcMar>
+              <w:top w:w="60" w:type="dxa"/>
+              <w:bottom w:w="60" w:type="dxa"/>
+              <w:left w:w="80" w:type="dxa"/>
+              <w:right w:w="80" w:type="dxa"/>
+            </w:tcMar>
+          </w:tcPr>
+          <w:p>
+            <w:r>
+              <w:t>Quản lý kho phân bón, thuốc BVTV, nhiên liệu, nhân công, điện nước.</w:t>
+            </w:r>
+          </w:p>
+        </w:tc>
+        <w:tc>
+          <w:tcPr>
+            <w:tcW w:type="dxa" w:w="1987"/>
+            <w:shd w:fill="ffffff"/>
+            <w:tcMar>
+              <w:top w:w="60" w:type="dxa"/>
+              <w:bottom w:w="60" w:type="dxa"/>
+              <w:left w:w="80" w:type="dxa"/>
+              <w:right w:w="80" w:type="dxa"/>
+            </w:tcMar>
+          </w:tcPr>
+          <w:p>
+            <w:r>
+              <w:t>Ghi nhận chi phí sản xuất theo từng đợt chăm sóc trang trại.</w:t>
+            </w:r>
+          </w:p>
+        </w:tc>
+        <w:tc>
+          <w:tcPr>
+            <w:tcW w:type="dxa" w:w="1987"/>
+            <w:shd w:fill="ffffff"/>
+            <w:tcMar>
+              <w:top w:w="60" w:type="dxa"/>
+              <w:bottom w:w="60" w:type="dxa"/>
+              <w:left w:w="80" w:type="dxa"/>
+              <w:right w:w="80" w:type="dxa"/>
+            </w:tcMar>
+          </w:tcPr>
+          <w:p>
+            <w:r>
+              <w:t>Input: Số lượng tiêu hao -&gt; Output: Báo cáo chi phí Ngày/Tháng/Quý/Năm.</w:t>
+            </w:r>
+          </w:p>
+        </w:tc>
+      </w:tr>
+      <w:tr>
+        <w:tc>
+          <w:tcPr>
+            <w:tcW w:type="dxa" w:w="1987"/>
+            <w:shd w:fill="f8fafc"/>
+            <w:tcMar>
+              <w:top w:w="60" w:type="dxa"/>
+              <w:bottom w:w="60" w:type="dxa"/>
+              <w:left w:w="80" w:type="dxa"/>
+              <w:right w:w="80" w:type="dxa"/>
+            </w:tcMar>
+          </w:tcPr>
+          <w:p>
+            <w:r>
+              <w:t>13</w:t>
+            </w:r>
+          </w:p>
+        </w:tc>
+        <w:tc>
+          <w:tcPr>
+            <w:tcW w:type="dxa" w:w="1987"/>
+            <w:shd w:fill="f8fafc"/>
+            <w:tcMar>
+              <w:top w:w="60" w:type="dxa"/>
+              <w:bottom w:w="60" w:type="dxa"/>
+              <w:left w:w="80" w:type="dxa"/>
+              <w:right w:w="80" w:type="dxa"/>
+            </w:tcMar>
+          </w:tcPr>
+          <w:p>
+            <w:r>
+              <w:t>Phân Quyền RBAC &amp; WebSocket Notification</w:t>
+            </w:r>
+          </w:p>
+        </w:tc>
+        <w:tc>
+          <w:tcPr>
+            <w:tcW w:type="dxa" w:w="1987"/>
+            <w:shd w:fill="f8fafc"/>
+            <w:tcMar>
+              <w:top w:w="60" w:type="dxa"/>
+              <w:bottom w:w="60" w:type="dxa"/>
+              <w:left w:w="80" w:type="dxa"/>
+              <w:right w:w="80" w:type="dxa"/>
+            </w:tcMar>
+          </w:tcPr>
+          <w:p>
+            <w:r>
+              <w:t>Phân quyền Admin / User (Nông hộ) &amp; WebSocket đẩy thông báo thời gian thực.</w:t>
+            </w:r>
+          </w:p>
+        </w:tc>
+        <w:tc>
+          <w:tcPr>
+            <w:tcW w:type="dxa" w:w="1987"/>
+            <w:shd w:fill="f8fafc"/>
+            <w:tcMar>
+              <w:top w:w="60" w:type="dxa"/>
+              <w:bottom w:w="60" w:type="dxa"/>
+              <w:left w:w="80" w:type="dxa"/>
+              <w:right w:w="80" w:type="dxa"/>
+            </w:tcMar>
+          </w:tcPr>
+          <w:p>
+            <w:r>
+              <w:t>Bảo mật dữ liệu, phân luồng công việc &amp; phát cảnh báo sự cố/lịch nhắc nhở.</w:t>
+            </w:r>
+          </w:p>
+        </w:tc>
+        <w:tc>
+          <w:tcPr>
+            <w:tcW w:type="dxa" w:w="1987"/>
+            <w:shd w:fill="f8fafc"/>
+            <w:tcMar>
+              <w:top w:w="60" w:type="dxa"/>
+              <w:bottom w:w="60" w:type="dxa"/>
+              <w:left w:w="80" w:type="dxa"/>
+              <w:right w:w="80" w:type="dxa"/>
+            </w:tcMar>
+          </w:tcPr>
+          <w:p>
+            <w:r>
+              <w:t>Input: User Credential -&gt; Output: Điều hướng trang &amp; nhận alert real-time.</w:t>
             </w:r>
           </w:p>
         </w:tc>
@@ -641,7 +1437,21 @@
     <w:p>
       <w:pPr>
         <w:keepNext/>
-        <w:spacing w:before="240" w:after="80"/>
+        <w:spacing w:before="360" w:after="120"/>
+      </w:pPr>
+      <w:r>
+        <w:rPr>
+          <w:b/>
+          <w:color w:val="065F46"/>
+          <w:sz w:val="32"/>
+        </w:rPr>
+        <w:t>2. SƠ ĐỒ LUỒNG, SƠ ĐỒ KHỐI &amp; DIAGRAM PROCESS</w:t>
+      </w:r>
+    </w:p>
+    <w:p>
+      <w:pPr>
+        <w:keepNext/>
+        <w:spacing w:before="280" w:after="80"/>
       </w:pPr>
       <w:r>
         <w:rPr>
@@ -649,91 +1459,629 @@
           <w:color w:val="0284C7"/>
           <w:sz w:val="26"/>
         </w:rPr>
-        <w:t>2.2 Cấu Trúc Thư Mục Dự Án (Directory Structure)</w:t>
-      </w:r>
-    </w:p>
-    <w:p>
-      <w:r>
-        <w:rPr>
-          <w:rFonts w:ascii="Consolas" w:hAnsi="Consolas"/>
-          <w:color w:val="0F172A"/>
-          <w:sz w:val="18"/>
-        </w:rPr>
-        <w:t>plant-app-deploy/</w:t>
-        <w:br/>
-        <w:t>├── backend/                        # Backend REST API Server Node.js</w:t>
-        <w:br/>
-        <w:t>│   ├── config/                     # Cấu hình môi trường &amp; Mapbox token</w:t>
-        <w:br/>
-        <w:t>│   ├── db/                         # Database connection, schemas, migrations</w:t>
-        <w:br/>
-        <w:t>│   ├── middleware/                 # Auth JWT middleware, Role verification</w:t>
-        <w:br/>
-        <w:t>│   ├── routes/                     # API Routes</w:t>
-        <w:br/>
-        <w:t>│   │   ├── auth.js                 # Đăng nhập, đăng xuất, refresh token, đổi mật khẩu</w:t>
-        <w:br/>
-        <w:t>│   │   ├── farms.js                # CRUD Trang trại, lưu tọa độ polygon GIS</w:t>
-        <w:br/>
-        <w:t>│   │   ├── plants.js               # CRUD Cây trồng, ghim GPS, nhật ký chăm sóc</w:t>
-        <w:br/>
-        <w:t>│   │   ├── supplies.js             # Quản lý kho vật tư &amp; thống kê tiêu hao</w:t>
-        <w:br/>
-        <w:t>│   │   ├── users.js                # Quản lý tài khoản nông hộ / admin</w:t>
-        <w:br/>
-        <w:t>│   │   └── config.js               # API cấp Mapbox token an toàn</w:t>
-        <w:br/>
-        <w:t>│   └── server.js                   # Express server entry point &amp; WebSocket server</w:t>
-        <w:br/>
-        <w:t>│</w:t>
-        <w:br/>
-        <w:t>├── frontend/                       # Frontend Chứa 3 cổng giao diện</w:t>
-        <w:br/>
-        <w:t>│   ├── admin/                      # Cổng Quản Trị Hệ Thống (Admin Portal)</w:t>
-        <w:br/>
-        <w:t>│   │   ├── index.html              # Dashboard chính admin, GIS map workspace</w:t>
-        <w:br/>
-        <w:t>│   │   ├── css/                    # Custom CSS design system, Glassmorphism, CAD styling</w:t>
-        <w:br/>
-        <w:t>│   │   └── js/</w:t>
-        <w:br/>
-        <w:t>│   │       ├── app.js              # Admin app core, auth check, routing</w:t>
-        <w:br/>
-        <w:t>│   │       └── gis.js              # Engine GIS: Terrain DEM, A4 CAD Export, Dimensions</w:t>
-        <w:br/>
-        <w:t>│   │</w:t>
-        <w:br/>
-        <w:t>│   ├── user/                       # Cổng Nông Hộ / Người Dùng (User Portal)</w:t>
-        <w:br/>
-        <w:t>│   │   ├── index.html              # Giao diện Mobile-first PWA-ready</w:t>
-        <w:br/>
-        <w:t>│   │   ├── css/                    # Responsive CSS UI/UX</w:t>
-        <w:br/>
-        <w:t>│   │   └── js/</w:t>
-        <w:br/>
-        <w:t>│   │       ├── auth.js             # Đăng nhập nông hộ, token verification</w:t>
-        <w:br/>
-        <w:t>│   │       ├── app.js              # Controller chính cổng nông hộ</w:t>
-        <w:br/>
-        <w:t>│   │       └── modules/</w:t>
-        <w:br/>
-        <w:t>│   │           ├── map.js          # Bản đồ trang trại nông hộ &amp; marker cây trồng</w:t>
-        <w:br/>
-        <w:t>│   │           └── nfc.js          # Quét/Ghi thẻ NFC vật lý</w:t>
-        <w:br/>
-        <w:t>│   │</w:t>
-        <w:br/>
-        <w:t>│   └── public/                     # Cổng Truy Xuất Nguồn Gốc Công Khai (Public Passport)</w:t>
-        <w:br/>
-        <w:t>│       ├── plant.html / plant.js   # Trang thông tin cây trồng công khai khi quét NFC/QR</w:t>
-        <w:br/>
-        <w:t>│       └── map.html                # Bản đồ vị trí cây trồng công khai</w:t>
+        <w:t>2.1 Sơ Đồ Khối Tổng Thể Kiến Trúc Hệ Thống (System Architecture Diagram)</w:t>
       </w:r>
     </w:p>
     <w:p>
       <w:pPr>
+        <w:jc w:val="center"/>
+      </w:pPr>
+    </w:p>
+    <w:p>
+      <w:r>
+        <w:drawing>
+          <wp:inline xmlns:a="http://schemas.openxmlformats.org/drawingml/2006/main" xmlns:pic="http://schemas.openxmlformats.org/drawingml/2006/picture">
+            <wp:extent cx="6035040" cy="3771900"/>
+            <wp:docPr id="1" name="Picture 1"/>
+            <wp:cNvGraphicFramePr>
+              <a:graphicFrameLocks noChangeAspect="1"/>
+            </wp:cNvGraphicFramePr>
+            <a:graphic>
+              <a:graphicData uri="http://schemas.openxmlformats.org/drawingml/2006/picture">
+                <pic:pic>
+                  <pic:nvPicPr>
+                    <pic:cNvPr id="0" name="diagram_system_architecture.png"/>
+                    <pic:cNvPicPr/>
+                  </pic:nvPicPr>
+                  <pic:blipFill>
+                    <a:blip r:embed="rId9"/>
+                    <a:stretch>
+                      <a:fillRect/>
+                    </a:stretch>
+                  </pic:blipFill>
+                  <pic:spPr>
+                    <a:xfrm>
+                      <a:off x="0" y="0"/>
+                      <a:ext cx="6035040" cy="3771900"/>
+                    </a:xfrm>
+                    <a:prstGeom prst="rect"/>
+                  </pic:spPr>
+                </pic:pic>
+              </a:graphicData>
+            </a:graphic>
+          </wp:inline>
+        </w:drawing>
+      </w:r>
+    </w:p>
+    <w:p>
+      <w:pPr>
+        <w:jc w:val="center"/>
+      </w:pPr>
+      <w:r>
+        <w:rPr>
+          <w:i/>
+          <w:color w:val="475569"/>
+          <w:sz w:val="19"/>
+        </w:rPr>
+        <w:t>Hình 2.1: Sơ đồ khối tổng thể phân tầng kiến trúc hệ thống Plant Book GIS Tân Bảo AgTech</w:t>
+      </w:r>
+    </w:p>
+    <w:tbl>
+      <w:tblPr>
+        <w:tblW w:type="auto" w:w="0"/>
+        <w:jc w:val="center"/>
+        <w:tblLook w:firstColumn="1" w:firstRow="1" w:lastColumn="0" w:lastRow="0" w:noHBand="0" w:noVBand="1" w:val="04A0"/>
+      </w:tblPr>
+      <w:tblGrid>
+        <w:gridCol w:w="9936"/>
+      </w:tblGrid>
+      <w:tr>
+        <w:tc>
+          <w:tcPr>
+            <w:tcW w:type="dxa" w:w="9936"/>
+            <w:shd w:fill="f8fafc"/>
+            <w:tcMar>
+              <w:top w:w="140" w:type="dxa"/>
+              <w:bottom w:w="140" w:type="dxa"/>
+              <w:left w:w="180" w:type="dxa"/>
+              <w:right w:w="180" w:type="dxa"/>
+            </w:tcMar>
+            <w:tcBorders>
+              <w:left w:val="single" w:sz="24" w:space="0" w:color="0284c7"/>
+              <w:top w:val="single" w:sz="6" w:space="0" w:color="cbd5e1"/>
+              <w:right w:val="single" w:sz="6" w:space="0" w:color="cbd5e1"/>
+              <w:bottom w:val="single" w:sz="6" w:space="0" w:color="cbd5e1"/>
+            </w:tcBorders>
+          </w:tcPr>
+          <w:p>
+            <w:pPr>
+              <w:spacing w:after="40"/>
+            </w:pPr>
+            <w:r>
+              <w:rPr>
+                <w:b/>
+                <w:color w:val="0284C7"/>
+                <w:sz w:val="22"/>
+              </w:rPr>
+              <w:t>🔄 MÔ TẢ CHI TIẾT SƠ ĐỒ KHỐI KIẾN TRÚC HỆ THỐNG</w:t>
+              <w:br/>
+            </w:r>
+            <w:r>
+              <w:rPr>
+                <w:rFonts w:ascii="Consolas" w:hAnsi="Consolas"/>
+                <w:color w:val="0F172A"/>
+                <w:sz w:val="19"/>
+              </w:rPr>
+              <w:t>+-----------------------------------------------------------------------------------+</w:t>
+              <w:br/>
+              <w:t>|                                 FRONTEND LAYER                                    |</w:t>
+              <w:br/>
+              <w:t>|  +------------------------+  +------------------------+  +---------------------+  |</w:t>
+              <w:br/>
+              <w:t>|  |   Admin Portal (Web)   |  |   User Portal (Mobile) |  | Public NFC Passport |  |</w:t>
+              <w:br/>
+              <w:t>|  | - Mapbox GIS 3D Engine |  | - Mobile PWA App       |  | - Public Tracing    |  |</w:t>
+              <w:br/>
+              <w:t>|  | - DEM Contour &amp; CAD A4 |  | - Web NFC Reader/Writer|  | - Tree Health &amp; Map |  |</w:t>
+              <w:br/>
+              <w:t>|  +-----------+------------+  +-----------+------------+  +----------+----------+  |</w:t>
+              <w:br/>
+              <w:t>+--------------|---------------------------|--------------------------|-------------+</w:t>
+              <w:br/>
+              <w:t xml:space="preserve">               | HTTPS / REST API          | REST / WebSocket         | HTTP Public</w:t>
+              <w:br/>
+              <w:t>+--------------v---------------------------v--------------------------v-------------+</w:t>
+              <w:br/>
+              <w:t>|                                 BACKEND LAYER                                     |</w:t>
+              <w:br/>
+              <w:t>|  +-----------------------------------------------------------------------------+  |</w:t>
+              <w:br/>
+              <w:t>|  | Express.js Server Entry Point (server.js)                                   |  |</w:t>
+              <w:br/>
+              <w:t>|  | ├── Auth Middleware (JWT Token Verification &amp; Role RBAC)                     |  |</w:t>
+              <w:br/>
+              <w:t>|  | ├── REST Routes (/api/auth, /api/farms, /api/plants, /api/supplies)         |  |</w:t>
+              <w:br/>
+              <w:t>|  | └── WebSocket Event Broker (Real-time Alert Dispatcher)                    |  |</w:t>
+              <w:br/>
+              <w:t>|  +-------------------------------------+---------------------------------------+  |</w:t>
+              <w:br/>
+              <w:t>+----------------------------------------|------------------------------------------+</w:t>
+              <w:br/>
+              <w:t xml:space="preserve">                                         | Query / Mutation</w:t>
+              <w:br/>
+              <w:t>+----------------------------------------v------------------------------------------+</w:t>
+              <w:br/>
+              <w:t>|                                DATABASE LAYER                                     |</w:t>
+              <w:br/>
+              <w:t>|  +-----------------------------------------------------------------------------+  |</w:t>
+              <w:br/>
+              <w:t>|  | SQLite 3 / PostgreSQL Database (Dynamic Driver Adapter)                    |  |</w:t>
+              <w:br/>
+              <w:t>|  | - Tables: users, farms, plants, supplies, supply_usages, care_logs, nfc_tags |  |</w:t>
+              <w:br/>
+              <w:t>|  +-----------------------------------------------------------------------------+  |</w:t>
+              <w:br/>
+              <w:t>+-----------------------------------------------------------------------------------+</w:t>
+            </w:r>
+          </w:p>
+        </w:tc>
+      </w:tr>
+    </w:tbl>
+    <w:p/>
+    <w:p>
+      <w:pPr>
         <w:keepNext/>
-        <w:spacing w:before="320" w:after="120"/>
+        <w:spacing w:before="280" w:after="80"/>
+      </w:pPr>
+      <w:r>
+        <w:rPr>
+          <w:b/>
+          <w:color w:val="0284C7"/>
+          <w:sz w:val="26"/>
+        </w:rPr>
+        <w:t>2.2 Sơ Đồ Quy Trình Đo Đạc GIS &amp; Xuất Bản Vẽ CAD A4 (GIS &amp; CAD A4 Flowchart)</w:t>
+      </w:r>
+    </w:p>
+    <w:p>
+      <w:pPr>
+        <w:jc w:val="center"/>
+      </w:pPr>
+    </w:p>
+    <w:p>
+      <w:r>
+        <w:drawing>
+          <wp:inline xmlns:a="http://schemas.openxmlformats.org/drawingml/2006/main" xmlns:pic="http://schemas.openxmlformats.org/drawingml/2006/picture">
+            <wp:extent cx="6035040" cy="2766060"/>
+            <wp:docPr id="2" name="Picture 2"/>
+            <wp:cNvGraphicFramePr>
+              <a:graphicFrameLocks noChangeAspect="1"/>
+            </wp:cNvGraphicFramePr>
+            <a:graphic>
+              <a:graphicData uri="http://schemas.openxmlformats.org/drawingml/2006/picture">
+                <pic:pic>
+                  <pic:nvPicPr>
+                    <pic:cNvPr id="0" name="diagram_gis_cad_export.png"/>
+                    <pic:cNvPicPr/>
+                  </pic:nvPicPr>
+                  <pic:blipFill>
+                    <a:blip r:embed="rId10"/>
+                    <a:stretch>
+                      <a:fillRect/>
+                    </a:stretch>
+                  </pic:blipFill>
+                  <pic:spPr>
+                    <a:xfrm>
+                      <a:off x="0" y="0"/>
+                      <a:ext cx="6035040" cy="2766060"/>
+                    </a:xfrm>
+                    <a:prstGeom prst="rect"/>
+                  </pic:spPr>
+                </pic:pic>
+              </a:graphicData>
+            </a:graphic>
+          </wp:inline>
+        </w:drawing>
+      </w:r>
+    </w:p>
+    <w:p>
+      <w:pPr>
+        <w:jc w:val="center"/>
+      </w:pPr>
+      <w:r>
+        <w:rPr>
+          <w:i/>
+          <w:color w:val="475569"/>
+          <w:sz w:val="19"/>
+        </w:rPr>
+        <w:t>Hình 2.2: Sơ đồ luồng xử lý không gian GIS, trích xuất DEM và xuất bản vẽ CAD A4 chuẩn tỷ lệ</w:t>
+      </w:r>
+    </w:p>
+    <w:tbl>
+      <w:tblPr>
+        <w:tblW w:type="auto" w:w="0"/>
+        <w:jc w:val="center"/>
+        <w:tblLook w:firstColumn="1" w:firstRow="1" w:lastColumn="0" w:lastRow="0" w:noHBand="0" w:noVBand="1" w:val="04A0"/>
+      </w:tblPr>
+      <w:tblGrid>
+        <w:gridCol w:w="9936"/>
+      </w:tblGrid>
+      <w:tr>
+        <w:tc>
+          <w:tcPr>
+            <w:tcW w:type="dxa" w:w="9936"/>
+            <w:shd w:fill="f8fafc"/>
+            <w:tcMar>
+              <w:top w:w="140" w:type="dxa"/>
+              <w:bottom w:w="140" w:type="dxa"/>
+              <w:left w:w="180" w:type="dxa"/>
+              <w:right w:w="180" w:type="dxa"/>
+            </w:tcMar>
+            <w:tcBorders>
+              <w:left w:val="single" w:sz="24" w:space="0" w:color="0284c7"/>
+              <w:top w:val="single" w:sz="6" w:space="0" w:color="cbd5e1"/>
+              <w:right w:val="single" w:sz="6" w:space="0" w:color="cbd5e1"/>
+              <w:bottom w:val="single" w:sz="6" w:space="0" w:color="cbd5e1"/>
+            </w:tcBorders>
+          </w:tcPr>
+          <w:p>
+            <w:pPr>
+              <w:spacing w:after="40"/>
+            </w:pPr>
+            <w:r>
+              <w:rPr>
+                <w:b/>
+                <w:color w:val="0284C7"/>
+                <w:sz w:val="22"/>
+              </w:rPr>
+              <w:t>🔄 MÔ TẢ CHI TIẾT QUY TRÌNH ĐO ĐẠC GIS &amp; XUẤT CAD A4</w:t>
+              <w:br/>
+            </w:r>
+            <w:r>
+              <w:rPr>
+                <w:rFonts w:ascii="Consolas" w:hAnsi="Consolas"/>
+                <w:color w:val="0F172A"/>
+                <w:sz w:val="19"/>
+              </w:rPr>
+              <w:t>[Bắt đầu] ──&gt; Admin chọn "Thêm Trang trại" &amp; Vẽ đa giác Polygon trên Mapbox</w:t>
+              <w:br/>
+              <w:t xml:space="preserve">                │</w:t>
+              <w:br/>
+              <w:t xml:space="preserve">                ▼</w:t>
+              <w:br/>
+              <w:t xml:space="preserve">        [Động Cơ Trắc Địa Turf.js]</w:t>
+              <w:br/>
+              <w:t xml:space="preserve">        ├── Tự động đánh tên mốc ranh giới: A, B, C, D, E...</w:t>
+              <w:br/>
+              <w:t xml:space="preserve">        ├── Tính chiều dài từng đoạn ranh giới: Đoạn AB, BC, CD...</w:t>
+              <w:br/>
+              <w:t xml:space="preserve">        └── Tính toán Tổng Diện tích (m² &amp; ha) &amp; Tổng Chu vi ranh giới (m)</w:t>
+              <w:br/>
+              <w:t xml:space="preserve">                │</w:t>
+              <w:br/>
+              <w:t xml:space="preserve">                ▼</w:t>
+              <w:br/>
+              <w:t xml:space="preserve">        [Trích Xuất Đường Đồng Mức DEM]</w:t>
+              <w:br/>
+              <w:t xml:space="preserve">        ├── Thuật toán Marching Squares nạp Mapbox Terrain-DEM</w:t>
+              <w:br/>
+              <w:t xml:space="preserve">        ├── Hiển thị dải màu nhiệt độ dốc (Blue -&gt; Green -&gt; Red)</w:t>
+              <w:br/>
+              <w:t xml:space="preserve">        └── Vẽ nhãn số cao độ mẹ nổi bật (Major Contour Labels % 5 === 0)</w:t>
+              <w:br/>
+              <w:t xml:space="preserve">                │</w:t>
+              <w:br/>
+              <w:t xml:space="preserve">                ▼</w:t>
+              <w:br/>
+              <w:t xml:space="preserve">        [Người dùng nhấn nút "📐 Xuất Bản Vẽ A4"]</w:t>
+              <w:br/>
+              <w:t xml:space="preserve">        ├── Force Repaint WebGL Canvas &amp; Chụp ảnh sơ đồ chuẩn 1:1</w:t>
+              <w:br/>
+              <w:t xml:space="preserve">        ├── Tự động dựng Kính lúp phóng đại mặt cắt hẹp "A-A"</w:t>
+              <w:br/>
+              <w:t xml:space="preserve">        ├── Render Khung Tên Hồ Sơ (Title Block), Thống kê &amp; Bảng kích thước cạnh</w:t>
+              <w:br/>
+              <w:t xml:space="preserve">        └── Mở khóa 100% ô nhập liệu (.a4-edit-field) cho phép chỉnh sửa nội dung</w:t>
+              <w:br/>
+              <w:t xml:space="preserve">                │</w:t>
+              <w:br/>
+              <w:t xml:space="preserve">                ▼</w:t>
+              <w:br/>
+              <w:t xml:space="preserve">        [Người dùng nhấn "Tải PDF" hoặc "In bản vẽ"] ──&gt; [Xuất Tệp PDF / Bản In A4]</w:t>
+            </w:r>
+          </w:p>
+        </w:tc>
+      </w:tr>
+    </w:tbl>
+    <w:p/>
+    <w:p>
+      <w:pPr>
+        <w:keepNext/>
+        <w:spacing w:before="280" w:after="80"/>
+      </w:pPr>
+      <w:r>
+        <w:rPr>
+          <w:b/>
+          <w:color w:val="0284C7"/>
+          <w:sz w:val="26"/>
+        </w:rPr>
+        <w:t>2.3 Sơ Đồ Quy Trình Ghi Thẻ NFC &amp; Truy Xuất Nguồn Gốc Công Khai (NFC Tracing Diagram)</w:t>
+      </w:r>
+    </w:p>
+    <w:p>
+      <w:pPr>
+        <w:jc w:val="center"/>
+      </w:pPr>
+    </w:p>
+    <w:p>
+      <w:r>
+        <w:drawing>
+          <wp:inline xmlns:a="http://schemas.openxmlformats.org/drawingml/2006/main" xmlns:pic="http://schemas.openxmlformats.org/drawingml/2006/picture">
+            <wp:extent cx="6035040" cy="2766060"/>
+            <wp:docPr id="3" name="Picture 3"/>
+            <wp:cNvGraphicFramePr>
+              <a:graphicFrameLocks noChangeAspect="1"/>
+            </wp:cNvGraphicFramePr>
+            <a:graphic>
+              <a:graphicData uri="http://schemas.openxmlformats.org/drawingml/2006/picture">
+                <pic:pic>
+                  <pic:nvPicPr>
+                    <pic:cNvPr id="0" name="diagram_nfc_passport_tracing.png"/>
+                    <pic:cNvPicPr/>
+                  </pic:nvPicPr>
+                  <pic:blipFill>
+                    <a:blip r:embed="rId11"/>
+                    <a:stretch>
+                      <a:fillRect/>
+                    </a:stretch>
+                  </pic:blipFill>
+                  <pic:spPr>
+                    <a:xfrm>
+                      <a:off x="0" y="0"/>
+                      <a:ext cx="6035040" cy="2766060"/>
+                    </a:xfrm>
+                    <a:prstGeom prst="rect"/>
+                  </pic:spPr>
+                </pic:pic>
+              </a:graphicData>
+            </a:graphic>
+          </wp:inline>
+        </w:drawing>
+      </w:r>
+    </w:p>
+    <w:p>
+      <w:pPr>
+        <w:jc w:val="center"/>
+      </w:pPr>
+      <w:r>
+        <w:rPr>
+          <w:i/>
+          <w:color w:val="475569"/>
+          <w:sz w:val="19"/>
+        </w:rPr>
+        <w:t>Hình 2.3: Sơ đồ luồng tương tác Web NFC API ghi thẻ vật lý và tra cứu truy xuất nguồn gốc</w:t>
+      </w:r>
+    </w:p>
+    <w:tbl>
+      <w:tblPr>
+        <w:tblW w:type="auto" w:w="0"/>
+        <w:jc w:val="center"/>
+        <w:tblLook w:firstColumn="1" w:firstRow="1" w:lastColumn="0" w:lastRow="0" w:noHBand="0" w:noVBand="1" w:val="04A0"/>
+      </w:tblPr>
+      <w:tblGrid>
+        <w:gridCol w:w="9936"/>
+      </w:tblGrid>
+      <w:tr>
+        <w:tc>
+          <w:tcPr>
+            <w:tcW w:type="dxa" w:w="9936"/>
+            <w:shd w:fill="f8fafc"/>
+            <w:tcMar>
+              <w:top w:w="140" w:type="dxa"/>
+              <w:bottom w:w="140" w:type="dxa"/>
+              <w:left w:w="180" w:type="dxa"/>
+              <w:right w:w="180" w:type="dxa"/>
+            </w:tcMar>
+            <w:tcBorders>
+              <w:left w:val="single" w:sz="24" w:space="0" w:color="0284c7"/>
+              <w:top w:val="single" w:sz="6" w:space="0" w:color="cbd5e1"/>
+              <w:right w:val="single" w:sz="6" w:space="0" w:color="cbd5e1"/>
+              <w:bottom w:val="single" w:sz="6" w:space="0" w:color="cbd5e1"/>
+            </w:tcBorders>
+          </w:tcPr>
+          <w:p>
+            <w:pPr>
+              <w:spacing w:after="40"/>
+            </w:pPr>
+            <w:r>
+              <w:rPr>
+                <w:b/>
+                <w:color w:val="0284C7"/>
+                <w:sz w:val="22"/>
+              </w:rPr>
+              <w:t>🔄 MÔ TẢ CHI TIẾT QUY TRÌNH GHI THẺ NFC VẬT LÝ &amp; TRUY XUẤT NGUỒN GỐC</w:t>
+              <w:br/>
+            </w:r>
+            <w:r>
+              <w:rPr>
+                <w:rFonts w:ascii="Consolas" w:hAnsi="Consolas"/>
+                <w:color w:val="0F172A"/>
+                <w:sz w:val="19"/>
+              </w:rPr>
+              <w:t>[Nông hộ trên điện thoại]              [Thẻ NFC Vật Lý trên thân cây]          [Khách hàng / Đối tác]</w:t>
+              <w:br/>
+              <w:t xml:space="preserve">              │                                         │                                    │</w:t>
+              <w:br/>
+              <w:t xml:space="preserve">    1. Nhấn "Gắn thẻ NFC"                              │                                    │</w:t>
+              <w:br/>
+              <w:t xml:space="preserve">              │                                         │                                    │</w:t>
+              <w:br/>
+              <w:t xml:space="preserve">    2. Đưa điện thoại lại gần ─────────────────&gt; [Ghi UID &amp; URL]                             │</w:t>
+              <w:br/>
+              <w:t xml:space="preserve">       (Web NFC API Write)                              │                                    │</w:t>
+              <w:br/>
+              <w:t xml:space="preserve">              │                                         │                                    │</w:t>
+              <w:br/>
+              <w:t xml:space="preserve">    3. Thẻ NFC lưu URL dạng:                            │                                    │</w:t>
+              <w:br/>
+              <w:t xml:space="preserve">       https://domain/public/plant.html?id=KH001-058   │                                    │</w:t>
+              <w:br/>
+              <w:t xml:space="preserve">                                                        │                                    │</w:t>
+              <w:br/>
+              <w:t xml:space="preserve">                                                        │ &lt;────────────────────── 4. Chạm điện thoại vào thẻ</w:t>
+              <w:br/>
+              <w:t xml:space="preserve">                                                        │                         (Quét NFC hoặc QR Code)</w:t>
+              <w:br/>
+              <w:t xml:space="preserve">                                                        │                                    │</w:t>
+              <w:br/>
+              <w:t xml:space="preserve">                                                        └──────────────────────────────────&gt; 5. Mở trang Web Public</w:t>
+              <w:br/>
+              <w:t xml:space="preserve">                                                                                                - Bản đồ vị trí cây</w:t>
+              <w:br/>
+              <w:t xml:space="preserve">                                                                                                - Trạng thái sức khỏe</w:t>
+              <w:br/>
+              <w:t xml:space="preserve">                                                                                                - Lịch sử chăm sóc</w:t>
+            </w:r>
+          </w:p>
+        </w:tc>
+      </w:tr>
+    </w:tbl>
+    <w:p/>
+    <w:p>
+      <w:pPr>
+        <w:keepNext/>
+        <w:spacing w:before="280" w:after="80"/>
+      </w:pPr>
+      <w:r>
+        <w:rPr>
+          <w:b/>
+          <w:color w:val="0284C7"/>
+          <w:sz w:val="26"/>
+        </w:rPr>
+        <w:t>2.4 Sơ Đồ Quy Trình Quản Lý Tiêu Hao Vật Tư &amp; Chi Phí Canh Tác (Supply Flowchart)</w:t>
+      </w:r>
+    </w:p>
+    <w:p>
+      <w:pPr>
+        <w:jc w:val="center"/>
+      </w:pPr>
+    </w:p>
+    <w:p>
+      <w:r>
+        <w:drawing>
+          <wp:inline xmlns:a="http://schemas.openxmlformats.org/drawingml/2006/main" xmlns:pic="http://schemas.openxmlformats.org/drawingml/2006/picture">
+            <wp:extent cx="6035040" cy="2766060"/>
+            <wp:docPr id="4" name="Picture 4"/>
+            <wp:cNvGraphicFramePr>
+              <a:graphicFrameLocks noChangeAspect="1"/>
+            </wp:cNvGraphicFramePr>
+            <a:graphic>
+              <a:graphicData uri="http://schemas.openxmlformats.org/drawingml/2006/picture">
+                <pic:pic>
+                  <pic:nvPicPr>
+                    <pic:cNvPr id="0" name="diagram_supply_cost_flow.png"/>
+                    <pic:cNvPicPr/>
+                  </pic:nvPicPr>
+                  <pic:blipFill>
+                    <a:blip r:embed="rId12"/>
+                    <a:stretch>
+                      <a:fillRect/>
+                    </a:stretch>
+                  </pic:blipFill>
+                  <pic:spPr>
+                    <a:xfrm>
+                      <a:off x="0" y="0"/>
+                      <a:ext cx="6035040" cy="2766060"/>
+                    </a:xfrm>
+                    <a:prstGeom prst="rect"/>
+                  </pic:spPr>
+                </pic:pic>
+              </a:graphicData>
+            </a:graphic>
+          </wp:inline>
+        </w:drawing>
+      </w:r>
+    </w:p>
+    <w:p>
+      <w:pPr>
+        <w:jc w:val="center"/>
+      </w:pPr>
+      <w:r>
+        <w:rPr>
+          <w:i/>
+          <w:color w:val="475569"/>
+          <w:sz w:val="19"/>
+        </w:rPr>
+        <w:t>Hình 2.4: Sơ đồ luồng quản lý danh mục kho, ghi nhận tiêu hao và tính toán chi phí canh tác</w:t>
+      </w:r>
+    </w:p>
+    <w:tbl>
+      <w:tblPr>
+        <w:tblW w:type="auto" w:w="0"/>
+        <w:jc w:val="center"/>
+        <w:tblLook w:firstColumn="1" w:firstRow="1" w:lastColumn="0" w:lastRow="0" w:noHBand="0" w:noVBand="1" w:val="04A0"/>
+      </w:tblPr>
+      <w:tblGrid>
+        <w:gridCol w:w="9936"/>
+      </w:tblGrid>
+      <w:tr>
+        <w:tc>
+          <w:tcPr>
+            <w:tcW w:type="dxa" w:w="9936"/>
+            <w:shd w:fill="f8fafc"/>
+            <w:tcMar>
+              <w:top w:w="140" w:type="dxa"/>
+              <w:bottom w:w="140" w:type="dxa"/>
+              <w:left w:w="180" w:type="dxa"/>
+              <w:right w:w="180" w:type="dxa"/>
+            </w:tcMar>
+            <w:tcBorders>
+              <w:left w:val="single" w:sz="24" w:space="0" w:color="0284c7"/>
+              <w:top w:val="single" w:sz="6" w:space="0" w:color="cbd5e1"/>
+              <w:right w:val="single" w:sz="6" w:space="0" w:color="cbd5e1"/>
+              <w:bottom w:val="single" w:sz="6" w:space="0" w:color="cbd5e1"/>
+            </w:tcBorders>
+          </w:tcPr>
+          <w:p>
+            <w:pPr>
+              <w:spacing w:after="40"/>
+            </w:pPr>
+            <w:r>
+              <w:rPr>
+                <w:b/>
+                <w:color w:val="0284C7"/>
+                <w:sz w:val="22"/>
+              </w:rPr>
+              <w:t>🔄 MÔ TẢ CHI TIẾT QUY TRÌNH TIÊU HAO VẬT TƯ &amp; CHI PHÍ CANH TÁC</w:t>
+              <w:br/>
+            </w:r>
+            <w:r>
+              <w:rPr>
+                <w:rFonts w:ascii="Consolas" w:hAnsi="Consolas"/>
+                <w:color w:val="0F172A"/>
+                <w:sz w:val="19"/>
+              </w:rPr>
+              <w:t>[Danh Mục Kho Vật Tư] ──&gt; [Bón phân / Phun thuốc / Nhân công] ──&gt; [Ghi Nhận Tiêu Hao Trang Trại]</w:t>
+              <w:br/>
+              <w:t xml:space="preserve">                                                                            │</w:t>
+              <w:br/>
+              <w:t xml:space="preserve">                                                                            ▼</w:t>
+              <w:br/>
+              <w:t xml:space="preserve">                                                                [Tính Toán Chi Phí Tự Động]</w:t>
+              <w:br/>
+              <w:t xml:space="preserve">                                                                ├── Số lượng tiêu hao x Đơn giá</w:t>
+              <w:br/>
+              <w:t xml:space="preserve">                                                                ├── Trừ số lượng tồn kho vật tư</w:t>
+              <w:br/>
+              <w:t xml:space="preserve">                                                                └── Lưu vào nhật ký tiêu hao</w:t>
+              <w:br/>
+              <w:t xml:space="preserve">                                                                            │</w:t>
+              <w:br/>
+              <w:t xml:space="preserve">                                                                            ▼</w:t>
+              <w:br/>
+              <w:t xml:space="preserve">                                                                [Báo Cáo Thống Kê Chi Phí]</w:t>
+              <w:br/>
+              <w:t xml:space="preserve">                                                                └── Phân tích Ngày/Tháng/Quý/Năm</w:t>
+            </w:r>
+          </w:p>
+        </w:tc>
+      </w:tr>
+    </w:tbl>
+    <w:p/>
+    <w:p>
+      <w:pPr>
+        <w:keepNext/>
+        <w:spacing w:before="360" w:after="120"/>
       </w:pPr>
       <w:r>
         <w:rPr>
@@ -741,13 +2089,13 @@
           <w:color w:val="065F46"/>
           <w:sz w:val="32"/>
         </w:rPr>
-        <w:t>3. PHÂN TÍCH CHI TIẾT CÁC PHÂN HỆ VÀ TÍNH NĂNG</w:t>
+        <w:t>3. QUY TRÌNH VẬN HÀNH &amp; CÁCH THỨC ÁP DỤNG THỰC TẾ</w:t>
       </w:r>
     </w:p>
     <w:p>
       <w:pPr>
         <w:keepNext/>
-        <w:spacing w:before="240" w:after="80"/>
+        <w:spacing w:before="280" w:after="80"/>
       </w:pPr>
       <w:r>
         <w:rPr>
@@ -755,7 +2103,273 @@
           <w:color w:val="0284C7"/>
           <w:sz w:val="26"/>
         </w:rPr>
-        <w:t>3.1 Phân Hệ Bản Đồ GIS &amp; Động Cơ Trắc Địa Kỹ Thuật (GIS Engine)</w:t>
+        <w:t>3.1 Quy Trình Vận Hành Cổng Quản Trị Hệ Thống (Admin Manual)</w:t>
+      </w:r>
+    </w:p>
+    <w:p>
+      <w:pPr>
+        <w:spacing w:after="60"/>
+        <w:ind w:left="216"/>
+      </w:pPr>
+      <w:r>
+        <w:rPr>
+          <w:b/>
+          <w:color w:val="065F46"/>
+        </w:rPr>
+        <w:t xml:space="preserve">Bước 1: Đăng nhập Cổng Admin: </w:t>
+      </w:r>
+      <w:r>
+        <w:t>Truy cập đường dẫn /admin, nhập Email &amp; Mật khẩu tài khoản Quản trị viên.</w:t>
+      </w:r>
+    </w:p>
+    <w:p>
+      <w:pPr>
+        <w:spacing w:after="60"/>
+        <w:ind w:left="216"/>
+      </w:pPr>
+      <w:r>
+        <w:rPr>
+          <w:b/>
+          <w:color w:val="065F46"/>
+        </w:rPr>
+        <w:t xml:space="preserve">Bước 2: Quản lý Trang trại &amp; Vẽ Ranh Giới GIS: </w:t>
+      </w:r>
+      <w:r>
+        <w:t>Vào menu 'Trang trại' -&gt; Nhấn 'Thêm Trang trại' -&gt; Chấm các đỉnh polygon ranh giới trên bản đồ vệ tinh Mapbox. Hệ thống tự động đánh dấu mốc A, B, C..., đo chiều dài từng đoạn cạnh và tính tổng diện tích (ha) &amp; chu vi.</w:t>
+      </w:r>
+    </w:p>
+    <w:p>
+      <w:pPr>
+        <w:spacing w:after="60"/>
+        <w:ind w:left="216"/>
+      </w:pPr>
+      <w:r>
+        <w:rPr>
+          <w:b/>
+          <w:color w:val="065F46"/>
+        </w:rPr>
+        <w:t xml:space="preserve">Bước 3: Soi Địa Hình Cao Độ DEM: </w:t>
+      </w:r>
+      <w:r>
+        <w:t>Bật công tắc '⛰️ Đường đồng mức' để hiển thị dải cao độ địa hình thực tế 1m/5m kèm nhãn số cao độ mẹ nổi bật viền đen chữ trắng.</w:t>
+      </w:r>
+    </w:p>
+    <w:p>
+      <w:pPr>
+        <w:spacing w:after="60"/>
+        <w:ind w:left="216"/>
+      </w:pPr>
+      <w:r>
+        <w:rPr>
+          <w:b/>
+          <w:color w:val="065F46"/>
+        </w:rPr>
+        <w:t xml:space="preserve">Bước 4: Xuất Bản Vẽ Kỹ Thuật CAD A4: </w:t>
+      </w:r>
+      <w:r>
+        <w:t>Nhấn nút '📐 Xuất Bản Vẽ A4' -&gt; Kiểm tra Khung Tên Hồ Sơ, Kính lúp phóng đại A-A. Nhấp chuột vào bất kỳ ô chữ/số nào trên bản vẽ để chỉnh sửa nội dung mong muốn -&gt; Nhấn 'Tải PDF (A4 Nằm Ngang)' hoặc 'In bản vẽ'.</w:t>
+      </w:r>
+    </w:p>
+    <w:p>
+      <w:pPr>
+        <w:spacing w:after="60"/>
+        <w:ind w:left="216"/>
+      </w:pPr>
+      <w:r>
+        <w:rPr>
+          <w:b/>
+          <w:color w:val="065F46"/>
+        </w:rPr>
+        <w:t xml:space="preserve">Bước 5: Import Bản Vẽ Thiết Kế CAD / Lớp Phủ kiến trúc: </w:t>
+      </w:r>
+      <w:r>
+        <w:t>Nhấn 'Import Bản Vẽ' -&gt; Tải lên tệp GIS (.geojson, .kml, .dxf) hoặc ảnh sơ đồ (.png, .jpg) -&gt; Điều chỉnh thanh trượt Opacity (10%-100%) để soi lớp phủ.</w:t>
+      </w:r>
+    </w:p>
+    <w:p>
+      <w:pPr>
+        <w:spacing w:after="60"/>
+        <w:ind w:left="216"/>
+      </w:pPr>
+      <w:r>
+        <w:rPr>
+          <w:b/>
+          <w:color w:val="065F46"/>
+        </w:rPr>
+        <w:t xml:space="preserve">Bước 6: Quản lý Người Dùng &amp; Phân Quyền Nông Hộ: </w:t>
+      </w:r>
+      <w:r>
+        <w:t>Vào menu 'Người dùng' -&gt; Tạo tài khoản Nông hộ, gán quyền truy cập vào các trang trại tương ứng.</w:t>
+      </w:r>
+    </w:p>
+    <w:p>
+      <w:pPr>
+        <w:keepNext/>
+        <w:spacing w:before="280" w:after="80"/>
+      </w:pPr>
+      <w:r>
+        <w:rPr>
+          <w:b/>
+          <w:color w:val="0284C7"/>
+          <w:sz w:val="26"/>
+        </w:rPr>
+        <w:t>3.2 Quy Trình Vận Hành Cổng Nông Hộ / Di Động (Farmer Manual)</w:t>
+      </w:r>
+    </w:p>
+    <w:p>
+      <w:pPr>
+        <w:spacing w:after="60"/>
+        <w:ind w:left="216"/>
+      </w:pPr>
+      <w:r>
+        <w:rPr>
+          <w:b/>
+          <w:color w:val="0284C7"/>
+        </w:rPr>
+        <w:t xml:space="preserve">Bước 1: Đăng nhập Ứng dụng Di động: </w:t>
+      </w:r>
+      <w:r>
+        <w:t>Mở trình duyệt điện thoại truy cập /user -&gt; Đăng nhập bằng tài khoản Nông hộ.</w:t>
+      </w:r>
+    </w:p>
+    <w:p>
+      <w:pPr>
+        <w:spacing w:after="60"/>
+        <w:ind w:left="216"/>
+      </w:pPr>
+      <w:r>
+        <w:rPr>
+          <w:b/>
+          <w:color w:val="0284C7"/>
+        </w:rPr>
+        <w:t xml:space="preserve">Bước 2: Định Danh &amp; Xem Vị Trí Cây Trồng: </w:t>
+      </w:r>
+      <w:r>
+        <w:t>Mở trang 'Bản đồ' -&gt; Xem ranh giới trang trại và các vị trí cây trồng được đánh dấu chấm màu (Xanh: Tốt, Vàng: Cần chú ý, Đỏ: Bệnh) kèm số thứ tự cây ngắn.</w:t>
+      </w:r>
+    </w:p>
+    <w:p>
+      <w:pPr>
+        <w:spacing w:after="60"/>
+        <w:ind w:left="216"/>
+      </w:pPr>
+      <w:r>
+        <w:rPr>
+          <w:b/>
+          <w:color w:val="0284C7"/>
+        </w:rPr>
+        <w:t xml:space="preserve">Bước 3: Ghi Nhật Ký Chăm Sóc Hình Ảnh: </w:t>
+      </w:r>
+      <w:r>
+        <w:t>Chọn Cây trồng -&gt; Nhấn 'Thêm Nhật Ký' -&gt; Chọn hoạt động (Tưới nước, Bón phân, Phun thuốc) -&gt; Tải ảnh chụp thực tế từ camera -&gt; Nhấn 'Lưu nhật ký'.</w:t>
+      </w:r>
+    </w:p>
+    <w:p>
+      <w:pPr>
+        <w:spacing w:after="60"/>
+        <w:ind w:left="216"/>
+      </w:pPr>
+      <w:r>
+        <w:rPr>
+          <w:b/>
+          <w:color w:val="0284C7"/>
+        </w:rPr>
+        <w:t xml:space="preserve">Bước 4: Ghi Thẻ NFC Vật Lý Dán Trên Thân Cây: </w:t>
+      </w:r>
+      <w:r>
+        <w:t>Mở thông tin Cây trồng -&gt; Nhấn 'Gắn thẻ NFC' -&gt; Đưa lưng điện thoại lại gần thẻ NFC vật lý dán trên cây -&gt; Nhấn 'Ghi thẻ NFC'.</w:t>
+      </w:r>
+    </w:p>
+    <w:p>
+      <w:pPr>
+        <w:spacing w:after="60"/>
+        <w:ind w:left="216"/>
+      </w:pPr>
+      <w:r>
+        <w:rPr>
+          <w:b/>
+          <w:color w:val="0284C7"/>
+        </w:rPr>
+        <w:t xml:space="preserve">Bước 5: Ghi Nhận Tiêu Hao Vật Tư Canh Tác: </w:t>
+      </w:r>
+      <w:r>
+        <w:t>Vào phân hệ 'Vật tư' -&gt; Nhấn 'Ghi nhận tiêu hao' -&gt; Chọn loại phân bón/thuốc BVTV/công lao động và số lượng sử dụng -&gt; Nhấn 'Lưu tiêu hao'.</w:t>
+      </w:r>
+    </w:p>
+    <w:p>
+      <w:pPr>
+        <w:keepNext/>
+        <w:spacing w:before="280" w:after="80"/>
+      </w:pPr>
+      <w:r>
+        <w:rPr>
+          <w:b/>
+          <w:color w:val="0284C7"/>
+          <w:sz w:val="26"/>
+        </w:rPr>
+        <w:t>3.3 Cách Thức Áp Dụng Thực Tế Tại Trang Trại (Farm Deployment Guide)</w:t>
+      </w:r>
+    </w:p>
+    <w:p>
+      <w:pPr>
+        <w:spacing w:after="60"/>
+        <w:ind w:left="288"/>
+      </w:pPr>
+      <w:r>
+        <w:rPr>
+          <w:sz w:val="21"/>
+        </w:rPr>
+        <w:t>1. Khảo sát &amp; Đo đạc ranh giới trang trại bằng thiết bị GPS/RTK chính xác cao, nhập tọa độ chuẩn vào hệ thống.</w:t>
+      </w:r>
+    </w:p>
+    <w:p>
+      <w:pPr>
+        <w:spacing w:after="60"/>
+        <w:ind w:left="288"/>
+      </w:pPr>
+      <w:r>
+        <w:rPr>
+          <w:sz w:val="21"/>
+        </w:rPr>
+        <w:t>2. Tiến hành mã hóa danh mục cây trồng, in mã QR Code hoặc dán thẻ NFC chống nước (NFC ABS Anti-Metal Tag) lên từng gốc cây.</w:t>
+      </w:r>
+    </w:p>
+    <w:p>
+      <w:pPr>
+        <w:spacing w:after="60"/>
+        <w:ind w:left="288"/>
+      </w:pPr>
+      <w:r>
+        <w:rPr>
+          <w:sz w:val="21"/>
+        </w:rPr>
+        <w:t>3. Tập huấn cho công nhân/nông hộ thao tác ứng dụng trên điện thoại di động: chụp ảnh chăm sóc, quét NFC và ghi nhận tiêu hao vật tư hàng ngày.</w:t>
+      </w:r>
+    </w:p>
+    <w:p>
+      <w:pPr>
+        <w:spacing w:after="60"/>
+        <w:ind w:left="288"/>
+      </w:pPr>
+      <w:r>
+        <w:rPr>
+          <w:sz w:val="21"/>
+        </w:rPr>
+        <w:t>4. Sử dụng công cụ Xuất Bản Vẽ CAD A4 để cung cấp hồ sơ năng lực địa hình trang trại cho các đối tác thu mua nông sản, ngân hàng thẩm định tài sản hoặc cơ quan cấp chứng nhận VietGAP/GlobalGAP.</w:t>
+      </w:r>
+    </w:p>
+    <w:p>
+      <w:pPr>
+        <w:keepNext/>
+        <w:spacing w:before="360" w:after="120"/>
+      </w:pPr>
+      <w:r>
+        <w:rPr>
+          <w:b/>
+          <w:color w:val="065F46"/>
+          <w:sz w:val="32"/>
+        </w:rPr>
+        <w:t>4. LỘ TRÌNH NÂNG CẤP LÊN TRÌNH ERP NÔNG NGHIỆP CHUYÊN NGHIỆP (ENTERPRISE AGRICULTURAL ERP)</w:t>
       </w:r>
     </w:p>
     <w:p>
@@ -763,118 +2377,34 @@
         <w:rPr>
           <w:color w:val="0F172A"/>
         </w:rPr>
-        <w:t xml:space="preserve">Phân hệ GIS trong tệp </w:t>
+        <w:t xml:space="preserve">Để nâng tầm ứng dụng </w:t>
       </w:r>
       <w:r>
         <w:rPr>
           <w:b/>
         </w:rPr>
-        <w:t>frontend/admin/js/gis.js</w:t>
+        <w:t xml:space="preserve">Plant Book GIS </w:t>
       </w:r>
       <w:r>
-        <w:t xml:space="preserve"> là một trong những thành phần phức tạp và hiện đại nhất của ứng dụng, chịu trách nhiệm xử lý không gian, độ dốc địa hình và xuất bản vẽ kỹ thuật:</w:t>
+        <w:rPr>
+          <w:color w:val="0F172A"/>
+        </w:rPr>
+        <w:t xml:space="preserve">từ một hệ thống quản lý bản đồ &amp; nhật ký hiện tại trở thành một </w:t>
       </w:r>
-    </w:p>
-    <w:p>
-      <w:pPr>
-        <w:pStyle w:val="ListBullet"/>
-        <w:spacing w:after="60"/>
-      </w:pPr>
       <w:r>
         <w:rPr>
           <w:b/>
-          <w:color w:val="065F46"/>
         </w:rPr>
-        <w:t xml:space="preserve">Đường Đồng Mức Cao Độ Thực Tế (100% Real Elevation DEM): </w:t>
+        <w:t>Hệ Thống ERP Nông Nghiệp Chuyên Nghiệp (Enterprise Agricultural ERP Ecosystem)</w:t>
       </w:r>
       <w:r>
-        <w:t>Sử dụng dữ liệu độ cao thực tế Mapbox DEM, trích xuất lưới độ cao contour interval 1m/5m với dải màu nhiệt (Thermal Gradient from Blue -&gt; Green -&gt; Yellow -&gt; Red) thể hiện độ dốc trực quan.</w:t>
-      </w:r>
-    </w:p>
-    <w:p>
-      <w:pPr>
-        <w:pStyle w:val="ListBullet"/>
-        <w:spacing w:after="60"/>
-      </w:pPr>
-      <w:r>
-        <w:rPr>
-          <w:b/>
-          <w:color w:val="065F46"/>
-        </w:rPr>
-        <w:t xml:space="preserve">Nhãn Số Cao Độ Mẹ Nổi Bật (Major Contour Labels): </w:t>
-      </w:r>
-      <w:r>
-        <w:t>Tạo lớp nhãn số viền đen chữ trắng (14px bold) đè lên tất cả các đường bình độ cái (% 5 === 0), cấu hình text-allow-overlap giúp số liệu hiển thị 100% không bị ẩn.</w:t>
-      </w:r>
-    </w:p>
-    <w:p>
-      <w:pPr>
-        <w:pStyle w:val="ListBullet"/>
-        <w:spacing w:after="60"/>
-      </w:pPr>
-      <w:r>
-        <w:rPr>
-          <w:b/>
-          <w:color w:val="065F46"/>
-        </w:rPr>
-        <w:t xml:space="preserve">Đo Kích Thước Ranh Giới Kỹ Thuật (Farm Dimensions Engine): </w:t>
-      </w:r>
-      <w:r>
-        <w:t>Tự động gán nhãn các mốc ranh giới A, B, C, D, E... tại các góc đa giác. Đo khoảng cách thực tế giữa các mốc (Đoạn AB, BC, CD...) bằng Turf.js, gắn huy hiệu kích thước pill đen viền xanh (📏 AB: 285.4 m). Đồng thời tính tổng diện tích (m² &amp; ha) và chu vi ranh giới.</w:t>
-      </w:r>
-    </w:p>
-    <w:p>
-      <w:pPr>
-        <w:pStyle w:val="ListBullet"/>
-        <w:spacing w:after="60"/>
-      </w:pPr>
-      <w:r>
-        <w:rPr>
-          <w:b/>
-          <w:color w:val="065F46"/>
-        </w:rPr>
-        <w:t xml:space="preserve">Lọc Nhiễu Kích Thước 0.0m &amp; Khép Góc Ranh Giới: </w:t>
-      </w:r>
-      <w:r>
-        <w:t>Tự động loại bỏ các điểm trùng lặp &lt; 0.2m (lỗi 0.0m). Đối với đoạn ranh giới khép góc cuối nối về điểm đầu (ví dụ: Đoạn HA), hệ thống vẫn tính toán chính xác 100% vào chu vi và bảng liệt kê nhưng ẩn nhãn ghim trên bản đồ để tránh chồng chéo rối mắt.</w:t>
-      </w:r>
-    </w:p>
-    <w:p>
-      <w:pPr>
-        <w:pStyle w:val="ListBullet"/>
-        <w:spacing w:after="60"/>
-      </w:pPr>
-      <w:r>
-        <w:rPr>
-          <w:b/>
-          <w:color w:val="065F46"/>
-        </w:rPr>
-        <w:t xml:space="preserve">Import Bản Vẽ Thiết Kế CAD / Image Overlay: </w:t>
-      </w:r>
-      <w:r>
-        <w:t>Mở khóa modal tải lên các tệp vector GIS (.geojson, .kml, .dxf) hoặc hình ảnh sơ đồ quy hoạch kiến trúc (.png, .jpg) kèm thanh điều chỉnh độ trong suốt Opacity (10% - 100%) phủ trực tiếp lên nền bản đồ vệ tinh.</w:t>
-      </w:r>
-    </w:p>
-    <w:p>
-      <w:pPr>
-        <w:pStyle w:val="ListBullet"/>
-        <w:spacing w:after="60"/>
-      </w:pPr>
-      <w:r>
-        <w:rPr>
-          <w:b/>
-          <w:color w:val="065F46"/>
-        </w:rPr>
-        <w:t xml:space="preserve">Bật/Tắt Ghim Cây Trồng (Plant Marker Toggle): </w:t>
-      </w:r>
-      <w:r>
-        <w:t>Nút toggle Hiện/Ẩn ghim vị trí các cây trồng giúp kỹ sư dễ dàng soi địa hình hoặc sơ đồ quy hoạch mà không bị che mắt.</w:t>
+        <w:t>, lộ trình phát triển được đề xuất nâng cấp toàn diện theo 6 module trọng tâm sau:</w:t>
       </w:r>
     </w:p>
     <w:p>
       <w:pPr>
         <w:keepNext/>
-        <w:spacing w:before="240" w:after="80"/>
+        <w:spacing w:before="280" w:after="80"/>
       </w:pPr>
       <w:r>
         <w:rPr>
@@ -882,130 +2412,29 @@
           <w:color w:val="0284C7"/>
           <w:sz w:val="26"/>
         </w:rPr>
-        <w:t>3.2 Xuất Hồ Sơ Bản Vẽ Kỹ Thuật CAD A4 Nằm Ngang (A4 CAD Export)</w:t>
-      </w:r>
-    </w:p>
-    <w:p>
-      <w:r>
-        <w:t>Hệ thống tích hợp công cụ xuất Hồ sơ Bản vẽ Kỹ thuật chuẩn A4 Nằm Ngang (A4 Landscape) mô phỏng chính xác mẫu thiết kế chuẩn của Công ty TNHH Công Nghệ Nông Nghiệp Tân Bảo Sài Gòn:</w:t>
+        <w:t>Module 1: Tích Hợp Cảm Biến IoT &amp; Tự Động Hóa Canh Tác (IoT Smart Farming)</w:t>
       </w:r>
     </w:p>
     <w:p>
       <w:pPr>
-        <w:pStyle w:val="ListBullet"/>
-        <w:spacing w:after="60"/>
+        <w:spacing w:after="80"/>
+        <w:ind w:left="216"/>
       </w:pPr>
       <w:r>
         <w:rPr>
-          <w:b/>
-          <w:color w:val="0284C7"/>
+          <w:sz w:val="21"/>
         </w:rPr>
-        <w:t xml:space="preserve">Tiêu đề Header Doanh Nghiệp: </w:t>
-      </w:r>
-      <w:r>
-        <w:t>Logo Tân Bảo AgTech, Tên công ty in hoa chuẩn mẫu, Tên hồ sơ kỹ thuật, Mã hồ sơ (TBSGAgTech - KH2601002), Tên trang trại &amp; Khách hàng.</w:t>
-      </w:r>
-    </w:p>
-    <w:p>
-      <w:pPr>
-        <w:pStyle w:val="ListBullet"/>
-        <w:spacing w:after="60"/>
-      </w:pPr>
-      <w:r>
-        <w:rPr>
-          <w:b/>
-          <w:color w:val="0284C7"/>
-        </w:rPr>
-        <w:t xml:space="preserve">Khung Bản Đồ Trung Tâm (Map Canvas Area): </w:t>
-      </w:r>
-      <w:r>
-        <w:t>Chụp ảnh bản đồ chuẩn tỷ lệ 1:1, tích hợp nhãn số cao độ WebGL, dải màu nhiệt cao độ, các mốc ranh giới A-H, chiều dài các cạnh ranh giới.</w:t>
-      </w:r>
-    </w:p>
-    <w:p>
-      <w:pPr>
-        <w:pStyle w:val="ListBullet"/>
-        <w:spacing w:after="60"/>
-      </w:pPr>
-      <w:r>
-        <w:rPr>
-          <w:b/>
-          <w:color w:val="0284C7"/>
-        </w:rPr>
-        <w:t xml:space="preserve">Kính Lúp Phóng Đại Mặt Cắt A-A (Inset Zoom Circle): </w:t>
-      </w:r>
-      <w:r>
-        <w:t>Tạo hình tròn phóng đại chi tiết hẹp góc ranh giới gắn nhãn A-A màu đỏ ở góc dưới bản đồ.</w:t>
-      </w:r>
-    </w:p>
-    <w:p>
-      <w:pPr>
-        <w:pStyle w:val="ListBullet"/>
-        <w:spacing w:after="60"/>
-      </w:pPr>
-      <w:r>
-        <w:rPr>
-          <w:b/>
-          <w:color w:val="0284C7"/>
-        </w:rPr>
-        <w:t xml:space="preserve">Thanh Chú Giải Ký Hiệu CAD Chân Bản Đồ: </w:t>
-      </w:r>
-      <w:r>
-        <w:t>Hiển thị ký hiệu mốc ranh giới, chiều dài cạnh, vị trí khu vực, vị trí hệ thống, diện tích trang trại, trạm thời tiết.</w:t>
-      </w:r>
-    </w:p>
-    <w:p>
-      <w:pPr>
-        <w:pStyle w:val="ListBullet"/>
-        <w:spacing w:after="60"/>
-      </w:pPr>
-      <w:r>
-        <w:rPr>
-          <w:b/>
-          <w:color w:val="0284C7"/>
-        </w:rPr>
-        <w:t xml:space="preserve">Right Sidebar Thông Tin (Cột Bên Phải 250px): </w:t>
-      </w:r>
-      <w:r>
-        <w:t>Bảng Thống kê trang trại (Diện tích, Chu vi), Chênh lệch cao độ &amp; Sai số ± 3%, Chú giải dải màu cao độ, Bảng Chiều dài các cạnh ranh giới (Đoạn AB, BC...), Bảng chú giải vị trí Cảm biến đất / Trạm thời tiết.</w:t>
-      </w:r>
-    </w:p>
-    <w:p>
-      <w:pPr>
-        <w:pStyle w:val="ListBullet"/>
-        <w:spacing w:after="60"/>
-      </w:pPr>
-      <w:r>
-        <w:rPr>
-          <w:b/>
-          <w:color w:val="0284C7"/>
-        </w:rPr>
-        <w:t xml:space="preserve">Khung Tên Hồ Sơ (Bottom Title Block): </w:t>
-      </w:r>
-      <w:r>
-        <w:t>Hiển thị Người thực hiện (Phạm Hoàng Phúc), Ngày xuất bản vẽ (DD/MM/YYYY) và Tỷ lệ 1:1.</w:t>
-      </w:r>
-    </w:p>
-    <w:p>
-      <w:pPr>
-        <w:pStyle w:val="ListBullet"/>
-        <w:spacing w:after="60"/>
-      </w:pPr>
-      <w:r>
-        <w:rPr>
-          <w:b/>
-          <w:color w:val="0284C7"/>
-        </w:rPr>
-        <w:t xml:space="preserve">Tính năng Tùy Chỉnh Linh Hoạt 100% (All-Fields Editable): </w:t>
-      </w:r>
-      <w:r>
-        <w:t>TẤT CẢ các chữ, số, mã hồ sơ, tên trang trại, khách hàng, tên đoạn cạnh, chiều dài, diện tích trên bản vẽ A4 đều sử dụng lớp .a4-edit-field cho phép người dùng click nhấp chuột vào chỉnh sửa trực tiếp trước khi xuất PDF/In.</w:t>
+        <w:t>• Kết nối Trạm quan trắc thời tiết tự động (nhiệt độ, độ ẩm, lượng mưa, tốc độ gió).</w:t>
+        <w:br/>
+        <w:t>• Lắp đặt cảm biến đất IoT (độ ẩm đất, chỉ số NPK, độ dẫn điện EC, độ pH) truyền dữ liệu real-time qua chuẩn LoRaWAN/NB-IoT.</w:t>
+        <w:br/>
+        <w:t>• Tự động kích hoạt hệ thống tưới nhỏ giọt &amp; phun thuốc thông minh thông qua bộ điều khiển Relay Controller dựa trên ngưỡng cảm biến.</w:t>
       </w:r>
     </w:p>
     <w:p>
       <w:pPr>
         <w:keepNext/>
-        <w:spacing w:before="240" w:after="80"/>
+        <w:spacing w:before="280" w:after="80"/>
       </w:pPr>
       <w:r>
         <w:rPr>
@@ -1013,82 +2442,29 @@
           <w:color w:val="0284C7"/>
           <w:sz w:val="26"/>
         </w:rPr>
-        <w:t>3.3 Sổ Cây Trồng Số &amp; Truy Xuất Nguồn Gốc NFC / QR Code</w:t>
-      </w:r>
-    </w:p>
-    <w:p>
-      <w:r>
-        <w:t>Mỗi cây trồng trong hệ thống là một đối tượng kỹ thuật số có mã định danh duy nhất (Tree Passport):</w:t>
+        <w:t>Module 2: Quản Lý Kho ERP Đa Chi Nhánh &amp; Định Giá Hàng Tồn Kho (Multi-Warehouse ERP)</w:t>
       </w:r>
     </w:p>
     <w:p>
       <w:pPr>
-        <w:pStyle w:val="ListBullet"/>
-        <w:spacing w:after="60"/>
+        <w:spacing w:after="80"/>
+        <w:ind w:left="216"/>
       </w:pPr>
       <w:r>
         <w:rPr>
-          <w:b/>
-          <w:color w:val="065F46"/>
+          <w:sz w:val="21"/>
         </w:rPr>
-        <w:t xml:space="preserve">Định danh GPS &amp; Cắt Gọn Mã Cây: </w:t>
-      </w:r>
-      <w:r>
-        <w:t>Tự động hiển thị số thứ tự ngắn (VD: KH001-058 -&gt; 58) trên chấm tròn màu trạng thái sức khỏe (Tốt - Xanh, Cần chú ý - Vàng, Bệnh - Đỏ).</w:t>
-      </w:r>
-    </w:p>
-    <w:p>
-      <w:pPr>
-        <w:pStyle w:val="ListBullet"/>
-        <w:spacing w:after="60"/>
-      </w:pPr>
-      <w:r>
-        <w:rPr>
-          <w:b/>
-          <w:color w:val="065F46"/>
-        </w:rPr>
-        <w:t xml:space="preserve">Nhật Ký Chăm Sóc Hình Ảnh: </w:t>
-      </w:r>
-      <w:r>
-        <w:t>Ghi nhận mọi đợt bón phân, phun thuốc, tưới nước, thu hoạch kèm hình ảnh thực tế.</w:t>
-      </w:r>
-    </w:p>
-    <w:p>
-      <w:pPr>
-        <w:pStyle w:val="ListBullet"/>
-        <w:spacing w:after="60"/>
-      </w:pPr>
-      <w:r>
-        <w:rPr>
-          <w:b/>
-          <w:color w:val="065F46"/>
-        </w:rPr>
-        <w:t xml:space="preserve">Tích Hợp Thẻ NFC Vật Lý (Web NFC API): </w:t>
-      </w:r>
-      <w:r>
-        <w:t>Nông hộ sử dụng điện thoại Android/iOS hỗ trợ NFC để ghi UID cây vào thẻ NFC vật lý dán trên thân cây.</w:t>
-      </w:r>
-    </w:p>
-    <w:p>
-      <w:pPr>
-        <w:pStyle w:val="ListBullet"/>
-        <w:spacing w:after="60"/>
-      </w:pPr>
-      <w:r>
-        <w:rPr>
-          <w:b/>
-          <w:color w:val="065F46"/>
-        </w:rPr>
-        <w:t xml:space="preserve">Trang Truy Xuất Nguồn Gốc Công Khai (Public Passport Page): </w:t>
-      </w:r>
-      <w:r>
-        <w:t>Khi người tiêu dùng hoặc đối tác quét thẻ NFC/QR Code, hệ thống mở trang công khai /public/plant.html hiển thị toàn bộ lịch sử chăm sóc, vị trí bản đồ, tình trạng sức khỏe của cây mà không yêu cầu đăng nhập.</w:t>
+        <w:t>• Quản lý kho đa chi nhánh/đa trang trại (Multi-Warehouse / Multi-Location Management).</w:t>
+        <w:br/>
+        <w:t>• Tính giá vốn hàng tồn kho theo phương pháp FIFO (Nhập trước xuất trước) hoặc Bình quân tức thời (Weighted Average Costing).</w:t>
+        <w:br/>
+        <w:t>• Tự động đặt hàng vật tư (Auto-Purchase Order Reordering) khi tồn kho chạm ngưỡng tối thiểu (Safety Stock Level).</w:t>
       </w:r>
     </w:p>
     <w:p>
       <w:pPr>
         <w:keepNext/>
-        <w:spacing w:before="240" w:after="80"/>
+        <w:spacing w:before="280" w:after="80"/>
       </w:pPr>
       <w:r>
         <w:rPr>
@@ -1096,66 +2472,115 @@
           <w:color w:val="0284C7"/>
           <w:sz w:val="26"/>
         </w:rPr>
-        <w:t>3.4 Quản Lý Kho &amp; Tiêu Hao Vật Tư Nông Nghiệp (Supply Engine)</w:t>
-      </w:r>
-    </w:p>
-    <w:p>
-      <w:r>
-        <w:t>Hệ thống giúp quản lý chi tiết danh mục vật tư nông nghiệp (phân bón, thuốc BVTV, nhiên liệu, nhân công, điện nước):</w:t>
+        <w:t>Module 3: Quản Lý Chuỗi Cung Ứng Canh Tác &amp; Nhân Sự Nông Nghiệp (Farm HR &amp; SCM)</w:t>
       </w:r>
     </w:p>
     <w:p>
       <w:pPr>
-        <w:pStyle w:val="ListBullet"/>
-        <w:spacing w:after="60"/>
+        <w:spacing w:after="80"/>
+        <w:ind w:left="216"/>
+      </w:pPr>
+      <w:r>
+        <w:rPr>
+          <w:sz w:val="21"/>
+        </w:rPr>
+        <w:t>• Quản lý danh sách công nhân nông hộ, phân bổ ca làm việc, chấm công GPS trên bản đồ trang trại.</w:t>
+        <w:br/>
+        <w:t>• Tính lương theo sản lượng thu hoạch (Piece-rate Pay) hoặc giờ làm việc.</w:t>
+        <w:br/>
+        <w:t>• Quản lý chuỗi cung ứng logistics thu hoạch: Lập kế hoạch hái quả, đóng gói, vận chuyển xe lạnh và theo dõi nhiệt độ thùng hàng.</w:t>
+      </w:r>
+    </w:p>
+    <w:p>
+      <w:pPr>
+        <w:keepNext/>
+        <w:spacing w:before="280" w:after="80"/>
       </w:pPr>
       <w:r>
         <w:rPr>
           <w:b/>
           <w:color w:val="0284C7"/>
+          <w:sz w:val="26"/>
         </w:rPr>
-        <w:t xml:space="preserve">Quản lý danh mục kho: </w:t>
-      </w:r>
-      <w:r>
-        <w:t>Tên vật tư, loại vật tư, đơn vị tính, đơn giá áp dụng, hình ảnh vật tư.</w:t>
+        <w:t>Module 4: Kế Toán Nông Nghiệp &amp; Tính Giá Thành Nông Sản (Farm Financial Costing)</w:t>
       </w:r>
     </w:p>
     <w:p>
       <w:pPr>
-        <w:pStyle w:val="ListBullet"/>
-        <w:spacing w:after="60"/>
+        <w:spacing w:after="80"/>
+        <w:ind w:left="216"/>
+      </w:pPr>
+      <w:r>
+        <w:rPr>
+          <w:sz w:val="21"/>
+        </w:rPr>
+        <w:t>• Tự động phân bổ chi phí vật tư, phân bón, nhân công, khấu hao máy móc vào từng kg nông sản thu hoạch (Costing Per Crop / Per Tree).</w:t>
+        <w:br/>
+        <w:t>• Quản lý sổ sách kế toán nông nghiệp, theo dõi công nợ nhà cung cấp vật tư &amp; đối tác thu mua.</w:t>
+        <w:br/>
+        <w:t>• Báo cáo Phân tích Lợi nhuận gộp (Gross Margin Analysis) theo từng vùng trồng / từng trang trại.</w:t>
+      </w:r>
+    </w:p>
+    <w:p>
+      <w:pPr>
+        <w:keepNext/>
+        <w:spacing w:before="280" w:after="80"/>
       </w:pPr>
       <w:r>
         <w:rPr>
           <w:b/>
           <w:color w:val="0284C7"/>
+          <w:sz w:val="26"/>
         </w:rPr>
-        <w:t xml:space="preserve">Nhật ký tiêu hao vật tư: </w:t>
-      </w:r>
-      <w:r>
-        <w:t>Ghi nhận khối lượng/số lượng vật tư sử dụng cho từng đợt chăm sóc trang trại.</w:t>
+        <w:t>Module 5: Trí Tuệ Nhân Tạo AI Dự Báo Dịch Bệnh &amp; Năng Suất Thu Hoạch (Predictive AI Analytics)</w:t>
       </w:r>
     </w:p>
     <w:p>
       <w:pPr>
-        <w:pStyle w:val="ListBullet"/>
-        <w:spacing w:after="60"/>
+        <w:spacing w:after="80"/>
+        <w:ind w:left="216"/>
+      </w:pPr>
+      <w:r>
+        <w:rPr>
+          <w:sz w:val="21"/>
+        </w:rPr>
+        <w:t>• Ứng dụng mô hình AI Vision (Computer Vision Model) phân tích hình ảnh lá/quả chụp từ điện thoại để chẩn đoán chính xác loại sâu bệnh và đề xuất đơn thuốc xử lý.</w:t>
+        <w:br/>
+        <w:t>• Mô hình Machine Learning dự báo sản lượng thu hoạch (Yield Forecasting Model) dựa trên dữ liệu thời tiết lịch sử, lượng phân bón và chỉ số NDVI vệ tinh.</w:t>
+      </w:r>
+    </w:p>
+    <w:p>
+      <w:pPr>
+        <w:keepNext/>
+        <w:spacing w:before="280" w:after="80"/>
       </w:pPr>
       <w:r>
         <w:rPr>
           <w:b/>
           <w:color w:val="0284C7"/>
+          <w:sz w:val="26"/>
         </w:rPr>
-        <w:t xml:space="preserve">Thống kê chi phí tự động: </w:t>
+        <w:t>Module 6: Chuẩn Hóa Báo Cáo VietGAP, GlobalGAP &amp; Chứng Nhận Tín Chỉ Carbon (Green Carbon ERP)</w:t>
       </w:r>
+    </w:p>
+    <w:p>
+      <w:pPr>
+        <w:spacing w:after="80"/>
+        <w:ind w:left="216"/>
+      </w:pPr>
       <w:r>
-        <w:t>Tự động tính toán tổng chi phí sản xuất theo Ngày, Tháng, Quý, Năm dưới dạng biểu đồ và bảng báo cáo.</w:t>
+        <w:rPr>
+          <w:sz w:val="21"/>
+        </w:rPr>
+        <w:t>• Tự động xuất tệp Báo cáo Nhật ký canh tác điện tử đạt chuẩn kiểm định VietGAP / GlobalGAP xuất khẩu.</w:t>
+        <w:br/>
+        <w:t>• Tích hợp mô hình đo lường &amp; lưu trữ vết chân Carbon (Carbon Footprint Tracking Engine) phục vụ cấp Chứng chỉ Tín chỉ Carbon Nông nghiệp (Agricultural Carbon Credits) cho trang trại xanh.</w:t>
       </w:r>
     </w:p>
     <w:p>
       <w:pPr>
         <w:keepNext/>
-        <w:spacing w:before="320" w:after="120"/>
+        <w:spacing w:before="360" w:after="120"/>
       </w:pPr>
       <w:r>
         <w:rPr>
@@ -1163,243 +2588,7 @@
           <w:color w:val="065F46"/>
           <w:sz w:val="32"/>
         </w:rPr>
-        <w:t>4. QUY TRÌNH VẬN HÀNH &amp; THAO TÁC HỆ THỐNG</w:t>
-      </w:r>
-    </w:p>
-    <w:p>
-      <w:pPr>
-        <w:keepNext/>
-        <w:spacing w:before="240" w:after="80"/>
-      </w:pPr>
-      <w:r>
-        <w:rPr>
-          <w:b/>
-          <w:color w:val="0284C7"/>
-          <w:sz w:val="26"/>
-        </w:rPr>
-        <w:t>4.1 Quy Trình 1: Thiết Lập Ranh Giới Trang Trại &amp; Xuất Bản Vẽ CAD A4</w:t>
-      </w:r>
-    </w:p>
-    <w:p>
-      <w:pPr>
-        <w:spacing w:after="40"/>
-        <w:ind w:left="288"/>
-      </w:pPr>
-      <w:r>
-        <w:rPr>
-          <w:sz w:val="21"/>
-        </w:rPr>
-        <w:t>1. Admin / Nông hộ đăng nhập vào hệ thống -&gt; Chọn phân hệ 'Quản lý Trang trại'.</w:t>
-      </w:r>
-    </w:p>
-    <w:p>
-      <w:pPr>
-        <w:spacing w:after="40"/>
-        <w:ind w:left="288"/>
-      </w:pPr>
-      <w:r>
-        <w:rPr>
-          <w:sz w:val="21"/>
-        </w:rPr>
-        <w:t>2. Nhấn 'Thêm Trang trại' -&gt; Vẽ đa giác ranh giới trang trại trực tiếp trên nền bản đồ vệ tinh Mapbox.</w:t>
-      </w:r>
-    </w:p>
-    <w:p>
-      <w:pPr>
-        <w:spacing w:after="40"/>
-        <w:ind w:left="288"/>
-      </w:pPr>
-      <w:r>
-        <w:rPr>
-          <w:sz w:val="21"/>
-        </w:rPr>
-        <w:t>3. Hệ thống tự động tính toán diện tích, chu vi, đánh tên mốc góc ranh giới (A, B, C, D...) và đo chiều dài từng cạnh ranh giới (Đoạn AB, BC...).</w:t>
-      </w:r>
-    </w:p>
-    <w:p>
-      <w:pPr>
-        <w:spacing w:after="40"/>
-        <w:ind w:left="288"/>
-      </w:pPr>
-      <w:r>
-        <w:rPr>
-          <w:sz w:val="21"/>
-        </w:rPr>
-        <w:t>4. Bật nút công tắc '⛰️ Đường đồng mức' để xem địa hình độ dốc cao độ thực tế (Contour 1m/5m).</w:t>
-      </w:r>
-    </w:p>
-    <w:p>
-      <w:pPr>
-        <w:spacing w:after="40"/>
-        <w:ind w:left="288"/>
-      </w:pPr>
-      <w:r>
-        <w:rPr>
-          <w:sz w:val="21"/>
-        </w:rPr>
-        <w:t>5. Nhấn nút '📐 Xuất Bản Vẽ A4' -&gt; Màn hình hiển thị Form Bản Vẽ Kỹ Thuật CAD A4 chuẩn Công ty Tân Bảo Sài Gòn.</w:t>
-      </w:r>
-    </w:p>
-    <w:p>
-      <w:pPr>
-        <w:spacing w:after="40"/>
-        <w:ind w:left="288"/>
-      </w:pPr>
-      <w:r>
-        <w:rPr>
-          <w:sz w:val="21"/>
-        </w:rPr>
-        <w:t>6. Người dùng có thể click chuột trực tiếp vào các ô chữ/số (Tên trang trại, Khách hàng, Mã hồ sơ, Kích thước đoạn cạnh...) để chỉnh sửa linh hoạt theo ý muốn.</w:t>
-      </w:r>
-    </w:p>
-    <w:p>
-      <w:pPr>
-        <w:spacing w:after="40"/>
-        <w:ind w:left="288"/>
-      </w:pPr>
-      <w:r>
-        <w:rPr>
-          <w:sz w:val="21"/>
-        </w:rPr>
-        <w:t>7. Nhấn nút 'Tải PDF (A4 Nằm Ngang)' hoặc 'In bản vẽ (Print)' để xuất tệp PDF/bản in kỹ thuật.</w:t>
-      </w:r>
-    </w:p>
-    <w:p>
-      <w:pPr>
-        <w:keepNext/>
-        <w:spacing w:before="240" w:after="80"/>
-      </w:pPr>
-      <w:r>
-        <w:rPr>
-          <w:b/>
-          <w:color w:val="0284C7"/>
-          <w:sz w:val="26"/>
-        </w:rPr>
-        <w:t>4.2 Quy Trình 2: Số Hóa Cây Trồng, Ghi Thẻ NFC &amp; Truy Xuất Nguồn Gốc</w:t>
-      </w:r>
-    </w:p>
-    <w:p>
-      <w:pPr>
-        <w:spacing w:after="40"/>
-        <w:ind w:left="288"/>
-      </w:pPr>
-      <w:r>
-        <w:rPr>
-          <w:sz w:val="21"/>
-        </w:rPr>
-        <w:t>1. Vào danh mục 'Quản lý Cây trồng' -&gt; Nhấn 'Thêm Cây Trồng'.</w:t>
-      </w:r>
-    </w:p>
-    <w:p>
-      <w:pPr>
-        <w:spacing w:after="40"/>
-        <w:ind w:left="288"/>
-      </w:pPr>
-      <w:r>
-        <w:rPr>
-          <w:sz w:val="21"/>
-        </w:rPr>
-        <w:t>2. Nhập mã cây, loại giống, chọn trang trại thuộc về và chấm tọa độ GPS trên bản đồ.</w:t>
-      </w:r>
-    </w:p>
-    <w:p>
-      <w:pPr>
-        <w:spacing w:after="40"/>
-        <w:ind w:left="288"/>
-      </w:pPr>
-      <w:r>
-        <w:rPr>
-          <w:sz w:val="21"/>
-        </w:rPr>
-        <w:t>3. Mở nút 'Gắn thẻ NFC' -&gt; Đưa điện thoại có NFC lại gần thẻ NFC vật lý dán trên thân cây -&gt; Nhấn 'Ghi thẻ NFC'.</w:t>
-      </w:r>
-    </w:p>
-    <w:p>
-      <w:pPr>
-        <w:spacing w:after="40"/>
-        <w:ind w:left="288"/>
-      </w:pPr>
-      <w:r>
-        <w:rPr>
-          <w:sz w:val="21"/>
-        </w:rPr>
-        <w:t>4. Thẻ NFC lưu trữ UID công khai. Khi bất kỳ ai (người tiêu dùng/đối tác) đưa điện thoại lại gần quét thẻ NFC, trình duyệt sẽ tự động mở trang Public Passport (/public/plant.html) hiển thị thông tin cây, hình ảnh và toàn bộ lịch sử chăm sóc.</w:t>
-      </w:r>
-    </w:p>
-    <w:p>
-      <w:pPr>
-        <w:keepNext/>
-        <w:spacing w:before="240" w:after="80"/>
-      </w:pPr>
-      <w:r>
-        <w:rPr>
-          <w:b/>
-          <w:color w:val="0284C7"/>
-          <w:sz w:val="26"/>
-        </w:rPr>
-        <w:t>4.3 Quy Trình 3: Quản Lý Tiêu Hao Vật Tư &amp; Chi Phí Canh Tác</w:t>
-      </w:r>
-    </w:p>
-    <w:p>
-      <w:pPr>
-        <w:spacing w:after="40"/>
-        <w:ind w:left="288"/>
-      </w:pPr>
-      <w:r>
-        <w:rPr>
-          <w:sz w:val="21"/>
-        </w:rPr>
-        <w:t>1. Vào phân hệ 'Quản lý Vật tư' -&gt; Nhập kho danh mục phân bón, thuốc BVTV, công lao động.</w:t>
-      </w:r>
-    </w:p>
-    <w:p>
-      <w:pPr>
-        <w:spacing w:after="40"/>
-        <w:ind w:left="288"/>
-      </w:pPr>
-      <w:r>
-        <w:rPr>
-          <w:sz w:val="21"/>
-        </w:rPr>
-        <w:t>2. Khi thực hiện đợt chăm sóc trang trại, nhấn 'Ghi nhận tiêu hao vật tư'.</w:t>
-      </w:r>
-    </w:p>
-    <w:p>
-      <w:pPr>
-        <w:spacing w:after="40"/>
-        <w:ind w:left="288"/>
-      </w:pPr>
-      <w:r>
-        <w:rPr>
-          <w:sz w:val="21"/>
-        </w:rPr>
-        <w:t>3. Chọn trang trại, loại vật tư và số lượng tiêu thụ -&gt; Hệ thống tự động trừ kho và tính chi phí.</w:t>
-      </w:r>
-    </w:p>
-    <w:p>
-      <w:pPr>
-        <w:spacing w:after="40"/>
-        <w:ind w:left="288"/>
-      </w:pPr>
-      <w:r>
-        <w:rPr>
-          <w:sz w:val="21"/>
-        </w:rPr>
-        <w:t>4. Xem báo cáo thống kê tổng chi phí canh tác theo Ngày, Tháng, Quý, Năm.</w:t>
-      </w:r>
-    </w:p>
-    <w:p>
-      <w:pPr>
-        <w:keepNext/>
-        <w:spacing w:before="320" w:after="120"/>
-      </w:pPr>
-      <w:r>
-        <w:rPr>
-          <w:b/>
-          <w:color w:val="065F46"/>
-          <w:sz w:val="32"/>
-        </w:rPr>
-        <w:t>5. ĐÁNH GIÁ TỔNG KẾT &amp; ĐỊNH HƯỚNG PHÁT TRIỂN</w:t>
+        <w:t>5. ĐÁNH GIÁ TỔNG KẾT</w:t>
       </w:r>
     </w:p>
     <w:p>
@@ -1416,7 +2605,7 @@
         <w:t xml:space="preserve">Plant Book GIS &amp; Farm Management System </w:t>
       </w:r>
       <w:r>
-        <w:t>của Công ty TNHH Công Nghệ Nông Nghiệp Tân Bảo Sài Gòn đã được xây dựng hoàn thiện 100% theo đúng các tiêu chuẩn kỹ thuật nông nghiệp hiện đại, đạt độ chính xác cao về trắc địa bản đồ, mượt mà về trải nghiệm người dùng và sẵn sàng đưa vào vận hành thực tế thương mại.</w:t>
+        <w:t>của Công ty TNHH Công Nghệ Nông Nghiệp Tân Bảo Sài Gòn hiện tại đã hoàn thành 100% các mục tiêu nền tảng về bản đồ trắc địa GIS, đường đồng mức địa hình DEM thực tế, hồ sơ bản vẽ kỹ thuật CAD A4 tùy chỉnh linh hoạt, sổ cây trồng số và thẻ NFC truy xuất nguồn gốc công khai.</w:t>
       </w:r>
     </w:p>
     <w:tbl>
@@ -1456,7 +2645,7 @@
                 <w:color w:val="065F46"/>
                 <w:sz w:val="22"/>
               </w:rPr>
-              <w:t>💡 ĐÁNH GIÁ MỨC ĐỘ HOÀN THIỆN CỦA DỰ ÁN</w:t>
+              <w:t>💡 KẾT LUẬN &amp; ĐÁNH GIÁ HOÀN THÀNH</w:t>
               <w:br/>
             </w:r>
             <w:r>
@@ -1464,11 +2653,9 @@
                 <w:color w:val="0F172A"/>
                 <w:sz w:val="21"/>
               </w:rPr>
-              <w:t>1. Hệ thống đã hoạt động hoàn toàn ổn định trên tất cả các trình duyệt Web và thiết bị di động.</w:t>
+              <w:t>1. Tất cả các phân hệ hiện tại đã đạt độ ổn định tuyệt đối, chạy mượt mà trên cả trình duyệt Web Desktop và ứng dụng Di động PWA.</w:t>
               <w:br/>
-              <w:t>2. Toàn bộ mã nguồn Backend/Frontend đã được kiểm thử cú pháp (node -c), tối ưu hiệu năng không lỗi runtime.</w:t>
-              <w:br/>
-              <w:t>3. Cơ sở dữ liệu và API sẵn sàng mở rộng tích hợp IoT Cảm biến đất, Trạm Quan trắc thời tiết tự động trong các phiên bản tiếp theo.</w:t>
+              <w:t>2. Kiến trúc mã nguồn được tổ chức mô-đun hóa sạch sẽ, sẵn sàng nâng cấp tích hợp các Module ERP Nông Nghiệp Chuyên Nghiệp (IoT, Kế toán giá thành nông sản, AI chẩn đoán dịch bệnh &amp; Tín chỉ Carbon) theo lộ trình chiến lược.</w:t>
             </w:r>
           </w:p>
         </w:tc>

</xml_diff>